<commit_message>
Update practice report with code listings
</commit_message>
<xml_diff>
--- a/reports/practice_report_tulin.docx
+++ b/reports/practice_report_tulin.docx
@@ -3198,8 +3198,8 @@
     </w:p>
     <w:p>
       <w:pPr>
-        <w:spacing w:after="120" w:line="360" w:lineRule="auto"/>
-        <w:ind w:firstLine="709"/>
+        <w:spacing w:line="360" w:lineRule="auto" w:after="120"/>
+        <w:ind w:firstLine="700"/>
         <w:jc w:val="both"/>
       </w:pPr>
       <w:r>
@@ -3207,9 +3207,3953 @@
           <w:rFonts w:ascii="Times New Roman" w:hAnsi="Times New Roman"/>
           <w:sz w:val="28"/>
         </w:rPr>
-        <w:t>Приложение А. Структура репозитория: README.md, docs/, site/, src/, reports/. Приложение Б. Команда запуска вариативной части: python src/main.py --host 127.0.0.1 --port 8080.</w:t>
-      </w:r>
-    </w:p>
+        <w:t>Приложение А. Структура репозитория: README.md, docs/, site/, src/, reports/. Команда запуска вариативной части: python src/main.py --host 127.0.0.1 --port 8080.</w:t>
+      </w:r>
+    </w:p>
+    <w:p>
+      <w:pPr>
+        <w:spacing w:line="360" w:lineRule="auto" w:after="120"/>
+        <w:ind w:firstLine="700"/>
+        <w:jc w:val="both"/>
+      </w:pPr>
+      <w:r>
+        <w:rPr>
+          <w:rFonts w:ascii="Times New Roman" w:hAnsi="Times New Roman"/>
+          <w:sz w:val="28"/>
+        </w:rPr>
+        <w:t>Ниже приведены листинги исходного кода вариативной части, в которой реализован простой HTTP-сервер на Python.</w:t>
+      </w:r>
+    </w:p>
+    <w:p>
+      <w:pPr>
+        <w:pStyle w:val="2"/>
+      </w:pPr>
+      <w:r/>
+      <w:r>
+        <w:rPr>
+          <w:rFonts w:ascii="Times New Roman" w:hAnsi="Times New Roman"/>
+          <w:b/>
+          <w:color w:val="1F4E79"/>
+          <w:sz w:val="26"/>
+        </w:rPr>
+        <w:t>Приложение Б. Листинг файла main.py</w:t>
+      </w:r>
+    </w:p>
+    <w:p>
+      <w:pPr>
+        <w:spacing w:after="80"/>
+      </w:pPr>
+      <w:r>
+        <w:rPr>
+          <w:rFonts w:ascii="Times New Roman" w:hAnsi="Times New Roman"/>
+          <w:i/>
+          <w:sz w:val="24"/>
+        </w:rPr>
+        <w:t>Файл: src/main.py</w:t>
+      </w:r>
+    </w:p>
+    <w:tbl>
+      <w:tblPr>
+        <w:tblW w:type="auto" w:w="0"/>
+        <w:jc w:val="center"/>
+        <w:tblLook w:firstColumn="1" w:firstRow="1" w:lastColumn="0" w:lastRow="0" w:noHBand="0" w:noVBand="1" w:val="04A0"/>
+        <w:tblBorders>
+          <w:top w:val="single" w:sz="4" w:space="0" w:color="D5DEE8"/>
+          <w:left w:val="single" w:sz="4" w:space="0" w:color="D5DEE8"/>
+          <w:bottom w:val="single" w:sz="4" w:space="0" w:color="D5DEE8"/>
+          <w:right w:val="single" w:sz="4" w:space="0" w:color="D5DEE8"/>
+          <w:insideH w:val="single" w:sz="4" w:space="0" w:color="D5DEE8"/>
+          <w:insideV w:val="single" w:sz="4" w:space="0" w:color="D5DEE8"/>
+        </w:tblBorders>
+      </w:tblPr>
+      <w:tblGrid>
+        <w:gridCol w:w="9355"/>
+      </w:tblGrid>
+      <w:tr>
+        <w:tc>
+          <w:tcPr>
+            <w:tcW w:type="dxa" w:w="9355"/>
+            <w:shd w:fill="F7F9FC"/>
+          </w:tcPr>
+          <w:p>
+            <w:r/>
+          </w:p>
+          <w:p>
+            <w:pPr>
+              <w:spacing w:after="0" w:line="240" w:lineRule="auto"/>
+            </w:pPr>
+            <w:r>
+              <w:rPr>
+                <w:rFonts w:ascii="Courier New" w:hAnsi="Courier New"/>
+                <w:sz w:val="16"/>
+              </w:rPr>
+              <w:t>001  from __future__ import annotations</w:t>
+            </w:r>
+          </w:p>
+          <w:p>
+            <w:pPr>
+              <w:spacing w:after="0" w:line="240" w:lineRule="auto"/>
+            </w:pPr>
+            <w:r>
+              <w:rPr>
+                <w:rFonts w:ascii="Courier New" w:hAnsi="Courier New"/>
+                <w:sz w:val="16"/>
+              </w:rPr>
+              <w:t xml:space="preserve">002  </w:t>
+            </w:r>
+          </w:p>
+          <w:p>
+            <w:pPr>
+              <w:spacing w:after="0" w:line="240" w:lineRule="auto"/>
+            </w:pPr>
+            <w:r>
+              <w:rPr>
+                <w:rFonts w:ascii="Courier New" w:hAnsi="Courier New"/>
+                <w:sz w:val="16"/>
+              </w:rPr>
+              <w:t>003  import argparse</w:t>
+            </w:r>
+          </w:p>
+          <w:p>
+            <w:pPr>
+              <w:spacing w:after="0" w:line="240" w:lineRule="auto"/>
+            </w:pPr>
+            <w:r>
+              <w:rPr>
+                <w:rFonts w:ascii="Courier New" w:hAnsi="Courier New"/>
+                <w:sz w:val="16"/>
+              </w:rPr>
+              <w:t xml:space="preserve">004  </w:t>
+            </w:r>
+          </w:p>
+          <w:p>
+            <w:pPr>
+              <w:spacing w:after="0" w:line="240" w:lineRule="auto"/>
+            </w:pPr>
+            <w:r>
+              <w:rPr>
+                <w:rFonts w:ascii="Courier New" w:hAnsi="Courier New"/>
+                <w:sz w:val="16"/>
+              </w:rPr>
+              <w:t>005  from server import SimpleHTTPServer</w:t>
+            </w:r>
+          </w:p>
+          <w:p>
+            <w:pPr>
+              <w:spacing w:after="0" w:line="240" w:lineRule="auto"/>
+            </w:pPr>
+            <w:r>
+              <w:rPr>
+                <w:rFonts w:ascii="Courier New" w:hAnsi="Courier New"/>
+                <w:sz w:val="16"/>
+              </w:rPr>
+              <w:t xml:space="preserve">006  </w:t>
+            </w:r>
+          </w:p>
+          <w:p>
+            <w:pPr>
+              <w:spacing w:after="0" w:line="240" w:lineRule="auto"/>
+            </w:pPr>
+            <w:r>
+              <w:rPr>
+                <w:rFonts w:ascii="Courier New" w:hAnsi="Courier New"/>
+                <w:sz w:val="16"/>
+              </w:rPr>
+              <w:t xml:space="preserve">007  </w:t>
+            </w:r>
+          </w:p>
+          <w:p>
+            <w:pPr>
+              <w:spacing w:after="0" w:line="240" w:lineRule="auto"/>
+            </w:pPr>
+            <w:r>
+              <w:rPr>
+                <w:rFonts w:ascii="Courier New" w:hAnsi="Courier New"/>
+                <w:sz w:val="16"/>
+              </w:rPr>
+              <w:t>008  def parse_args() -&gt; argparse.Namespace:</w:t>
+            </w:r>
+          </w:p>
+          <w:p>
+            <w:pPr>
+              <w:spacing w:after="0" w:line="240" w:lineRule="auto"/>
+            </w:pPr>
+            <w:r>
+              <w:rPr>
+                <w:rFonts w:ascii="Courier New" w:hAnsi="Courier New"/>
+                <w:sz w:val="16"/>
+              </w:rPr>
+              <w:t>009      parser = argparse.ArgumentParser(description="Simple educational HTTP server")</w:t>
+            </w:r>
+          </w:p>
+          <w:p>
+            <w:pPr>
+              <w:spacing w:after="0" w:line="240" w:lineRule="auto"/>
+            </w:pPr>
+            <w:r>
+              <w:rPr>
+                <w:rFonts w:ascii="Courier New" w:hAnsi="Courier New"/>
+                <w:sz w:val="16"/>
+              </w:rPr>
+              <w:t>010      parser.add_argument("--host", default="127.0.0.1", help="Host to bind")</w:t>
+            </w:r>
+          </w:p>
+          <w:p>
+            <w:pPr>
+              <w:spacing w:after="0" w:line="240" w:lineRule="auto"/>
+            </w:pPr>
+            <w:r>
+              <w:rPr>
+                <w:rFonts w:ascii="Courier New" w:hAnsi="Courier New"/>
+                <w:sz w:val="16"/>
+              </w:rPr>
+              <w:t>011      parser.add_argument("--port", default=8080, type=int, help="Port to listen on")</w:t>
+            </w:r>
+          </w:p>
+          <w:p>
+            <w:pPr>
+              <w:spacing w:after="0" w:line="240" w:lineRule="auto"/>
+            </w:pPr>
+            <w:r>
+              <w:rPr>
+                <w:rFonts w:ascii="Courier New" w:hAnsi="Courier New"/>
+                <w:sz w:val="16"/>
+              </w:rPr>
+              <w:t>012      return parser.parse_args()</w:t>
+            </w:r>
+          </w:p>
+          <w:p>
+            <w:pPr>
+              <w:spacing w:after="0" w:line="240" w:lineRule="auto"/>
+            </w:pPr>
+            <w:r>
+              <w:rPr>
+                <w:rFonts w:ascii="Courier New" w:hAnsi="Courier New"/>
+                <w:sz w:val="16"/>
+              </w:rPr>
+              <w:t xml:space="preserve">013  </w:t>
+            </w:r>
+          </w:p>
+          <w:p>
+            <w:pPr>
+              <w:spacing w:after="0" w:line="240" w:lineRule="auto"/>
+            </w:pPr>
+            <w:r>
+              <w:rPr>
+                <w:rFonts w:ascii="Courier New" w:hAnsi="Courier New"/>
+                <w:sz w:val="16"/>
+              </w:rPr>
+              <w:t xml:space="preserve">014  </w:t>
+            </w:r>
+          </w:p>
+          <w:p>
+            <w:pPr>
+              <w:spacing w:after="0" w:line="240" w:lineRule="auto"/>
+            </w:pPr>
+            <w:r>
+              <w:rPr>
+                <w:rFonts w:ascii="Courier New" w:hAnsi="Courier New"/>
+                <w:sz w:val="16"/>
+              </w:rPr>
+              <w:t>015  def main() -&gt; None:</w:t>
+            </w:r>
+          </w:p>
+          <w:p>
+            <w:pPr>
+              <w:spacing w:after="0" w:line="240" w:lineRule="auto"/>
+            </w:pPr>
+            <w:r>
+              <w:rPr>
+                <w:rFonts w:ascii="Courier New" w:hAnsi="Courier New"/>
+                <w:sz w:val="16"/>
+              </w:rPr>
+              <w:t>016      args = parse_args()</w:t>
+            </w:r>
+          </w:p>
+          <w:p>
+            <w:pPr>
+              <w:spacing w:after="0" w:line="240" w:lineRule="auto"/>
+            </w:pPr>
+            <w:r>
+              <w:rPr>
+                <w:rFonts w:ascii="Courier New" w:hAnsi="Courier New"/>
+                <w:sz w:val="16"/>
+              </w:rPr>
+              <w:t>017      server = SimpleHTTPServer(host=args.host, port=args.port)</w:t>
+            </w:r>
+          </w:p>
+          <w:p>
+            <w:pPr>
+              <w:spacing w:after="0" w:line="240" w:lineRule="auto"/>
+            </w:pPr>
+            <w:r>
+              <w:rPr>
+                <w:rFonts w:ascii="Courier New" w:hAnsi="Courier New"/>
+                <w:sz w:val="16"/>
+              </w:rPr>
+              <w:t>018      server.serve_forever()</w:t>
+            </w:r>
+          </w:p>
+          <w:p>
+            <w:pPr>
+              <w:spacing w:after="0" w:line="240" w:lineRule="auto"/>
+            </w:pPr>
+            <w:r>
+              <w:rPr>
+                <w:rFonts w:ascii="Courier New" w:hAnsi="Courier New"/>
+                <w:sz w:val="16"/>
+              </w:rPr>
+              <w:t xml:space="preserve">019  </w:t>
+            </w:r>
+          </w:p>
+          <w:p>
+            <w:pPr>
+              <w:spacing w:after="0" w:line="240" w:lineRule="auto"/>
+            </w:pPr>
+            <w:r>
+              <w:rPr>
+                <w:rFonts w:ascii="Courier New" w:hAnsi="Courier New"/>
+                <w:sz w:val="16"/>
+              </w:rPr>
+              <w:t xml:space="preserve">020  </w:t>
+            </w:r>
+          </w:p>
+          <w:p>
+            <w:pPr>
+              <w:spacing w:after="0" w:line="240" w:lineRule="auto"/>
+            </w:pPr>
+            <w:r>
+              <w:rPr>
+                <w:rFonts w:ascii="Courier New" w:hAnsi="Courier New"/>
+                <w:sz w:val="16"/>
+              </w:rPr>
+              <w:t>021  if __name__ == "__main__":</w:t>
+            </w:r>
+          </w:p>
+          <w:p>
+            <w:pPr>
+              <w:spacing w:after="0" w:line="240" w:lineRule="auto"/>
+            </w:pPr>
+            <w:r>
+              <w:rPr>
+                <w:rFonts w:ascii="Courier New" w:hAnsi="Courier New"/>
+                <w:sz w:val="16"/>
+              </w:rPr>
+              <w:t>022      main()</w:t>
+            </w:r>
+          </w:p>
+        </w:tc>
+      </w:tr>
+    </w:tbl>
+    <w:p>
+      <w:pPr>
+        <w:pStyle w:val="2"/>
+      </w:pPr>
+      <w:r/>
+      <w:r>
+        <w:rPr>
+          <w:rFonts w:ascii="Times New Roman" w:hAnsi="Times New Roman"/>
+          <w:b/>
+          <w:color w:val="1F4E79"/>
+          <w:sz w:val="26"/>
+        </w:rPr>
+        <w:t>Приложение В. Листинг файла server.py</w:t>
+      </w:r>
+    </w:p>
+    <w:p>
+      <w:pPr>
+        <w:spacing w:after="80"/>
+      </w:pPr>
+      <w:r>
+        <w:rPr>
+          <w:rFonts w:ascii="Times New Roman" w:hAnsi="Times New Roman"/>
+          <w:i/>
+          <w:sz w:val="24"/>
+        </w:rPr>
+        <w:t>Файл: src/server.py</w:t>
+      </w:r>
+    </w:p>
+    <w:tbl>
+      <w:tblPr>
+        <w:tblW w:type="auto" w:w="0"/>
+        <w:jc w:val="center"/>
+        <w:tblLook w:firstColumn="1" w:firstRow="1" w:lastColumn="0" w:lastRow="0" w:noHBand="0" w:noVBand="1" w:val="04A0"/>
+        <w:tblBorders>
+          <w:top w:val="single" w:sz="4" w:space="0" w:color="D5DEE8"/>
+          <w:left w:val="single" w:sz="4" w:space="0" w:color="D5DEE8"/>
+          <w:bottom w:val="single" w:sz="4" w:space="0" w:color="D5DEE8"/>
+          <w:right w:val="single" w:sz="4" w:space="0" w:color="D5DEE8"/>
+          <w:insideH w:val="single" w:sz="4" w:space="0" w:color="D5DEE8"/>
+          <w:insideV w:val="single" w:sz="4" w:space="0" w:color="D5DEE8"/>
+        </w:tblBorders>
+      </w:tblPr>
+      <w:tblGrid>
+        <w:gridCol w:w="9355"/>
+      </w:tblGrid>
+      <w:tr>
+        <w:tc>
+          <w:tcPr>
+            <w:tcW w:type="dxa" w:w="9355"/>
+            <w:shd w:fill="F7F9FC"/>
+          </w:tcPr>
+          <w:p>
+            <w:r/>
+          </w:p>
+          <w:p>
+            <w:pPr>
+              <w:spacing w:after="0" w:line="240" w:lineRule="auto"/>
+            </w:pPr>
+            <w:r>
+              <w:rPr>
+                <w:rFonts w:ascii="Courier New" w:hAnsi="Courier New"/>
+                <w:sz w:val="16"/>
+              </w:rPr>
+              <w:t>001  from __future__ import annotations</w:t>
+            </w:r>
+          </w:p>
+          <w:p>
+            <w:pPr>
+              <w:spacing w:after="0" w:line="240" w:lineRule="auto"/>
+            </w:pPr>
+            <w:r>
+              <w:rPr>
+                <w:rFonts w:ascii="Courier New" w:hAnsi="Courier New"/>
+                <w:sz w:val="16"/>
+              </w:rPr>
+              <w:t xml:space="preserve">002  </w:t>
+            </w:r>
+          </w:p>
+          <w:p>
+            <w:pPr>
+              <w:spacing w:after="0" w:line="240" w:lineRule="auto"/>
+            </w:pPr>
+            <w:r>
+              <w:rPr>
+                <w:rFonts w:ascii="Courier New" w:hAnsi="Courier New"/>
+                <w:sz w:val="16"/>
+              </w:rPr>
+              <w:t>003  import mimetypes</w:t>
+            </w:r>
+          </w:p>
+          <w:p>
+            <w:pPr>
+              <w:spacing w:after="0" w:line="240" w:lineRule="auto"/>
+            </w:pPr>
+            <w:r>
+              <w:rPr>
+                <w:rFonts w:ascii="Courier New" w:hAnsi="Courier New"/>
+                <w:sz w:val="16"/>
+              </w:rPr>
+              <w:t>004  import socket</w:t>
+            </w:r>
+          </w:p>
+          <w:p>
+            <w:pPr>
+              <w:spacing w:after="0" w:line="240" w:lineRule="auto"/>
+            </w:pPr>
+            <w:r>
+              <w:rPr>
+                <w:rFonts w:ascii="Courier New" w:hAnsi="Courier New"/>
+                <w:sz w:val="16"/>
+              </w:rPr>
+              <w:t>005  from dataclasses import dataclass</w:t>
+            </w:r>
+          </w:p>
+          <w:p>
+            <w:pPr>
+              <w:spacing w:after="0" w:line="240" w:lineRule="auto"/>
+            </w:pPr>
+            <w:r>
+              <w:rPr>
+                <w:rFonts w:ascii="Courier New" w:hAnsi="Courier New"/>
+                <w:sz w:val="16"/>
+              </w:rPr>
+              <w:t>006  from datetime import datetime</w:t>
+            </w:r>
+          </w:p>
+          <w:p>
+            <w:pPr>
+              <w:spacing w:after="0" w:line="240" w:lineRule="auto"/>
+            </w:pPr>
+            <w:r>
+              <w:rPr>
+                <w:rFonts w:ascii="Courier New" w:hAnsi="Courier New"/>
+                <w:sz w:val="16"/>
+              </w:rPr>
+              <w:t>007  from pathlib import Path</w:t>
+            </w:r>
+          </w:p>
+          <w:p>
+            <w:pPr>
+              <w:spacing w:after="0" w:line="240" w:lineRule="auto"/>
+            </w:pPr>
+            <w:r>
+              <w:rPr>
+                <w:rFonts w:ascii="Courier New" w:hAnsi="Courier New"/>
+                <w:sz w:val="16"/>
+              </w:rPr>
+              <w:t>008  from typing import Callable</w:t>
+            </w:r>
+          </w:p>
+          <w:p>
+            <w:pPr>
+              <w:spacing w:after="0" w:line="240" w:lineRule="auto"/>
+            </w:pPr>
+            <w:r>
+              <w:rPr>
+                <w:rFonts w:ascii="Courier New" w:hAnsi="Courier New"/>
+                <w:sz w:val="16"/>
+              </w:rPr>
+              <w:t>009  from urllib.parse import unquote</w:t>
+            </w:r>
+          </w:p>
+          <w:p>
+            <w:pPr>
+              <w:spacing w:after="0" w:line="240" w:lineRule="auto"/>
+            </w:pPr>
+            <w:r>
+              <w:rPr>
+                <w:rFonts w:ascii="Courier New" w:hAnsi="Courier New"/>
+                <w:sz w:val="16"/>
+              </w:rPr>
+              <w:t xml:space="preserve">010  </w:t>
+            </w:r>
+          </w:p>
+          <w:p>
+            <w:pPr>
+              <w:spacing w:after="0" w:line="240" w:lineRule="auto"/>
+            </w:pPr>
+            <w:r>
+              <w:rPr>
+                <w:rFonts w:ascii="Courier New" w:hAnsi="Courier New"/>
+                <w:sz w:val="16"/>
+              </w:rPr>
+              <w:t xml:space="preserve">011  </w:t>
+            </w:r>
+          </w:p>
+          <w:p>
+            <w:pPr>
+              <w:spacing w:after="0" w:line="240" w:lineRule="auto"/>
+            </w:pPr>
+            <w:r>
+              <w:rPr>
+                <w:rFonts w:ascii="Courier New" w:hAnsi="Courier New"/>
+                <w:sz w:val="16"/>
+              </w:rPr>
+              <w:t>012  CRLF = "\r\n"</w:t>
+            </w:r>
+          </w:p>
+          <w:p>
+            <w:pPr>
+              <w:spacing w:after="0" w:line="240" w:lineRule="auto"/>
+            </w:pPr>
+            <w:r>
+              <w:rPr>
+                <w:rFonts w:ascii="Courier New" w:hAnsi="Courier New"/>
+                <w:sz w:val="16"/>
+              </w:rPr>
+              <w:t xml:space="preserve">013  </w:t>
+            </w:r>
+          </w:p>
+          <w:p>
+            <w:pPr>
+              <w:spacing w:after="0" w:line="240" w:lineRule="auto"/>
+            </w:pPr>
+            <w:r>
+              <w:rPr>
+                <w:rFonts w:ascii="Courier New" w:hAnsi="Courier New"/>
+                <w:sz w:val="16"/>
+              </w:rPr>
+              <w:t xml:space="preserve">014  </w:t>
+            </w:r>
+          </w:p>
+          <w:p>
+            <w:pPr>
+              <w:spacing w:after="0" w:line="240" w:lineRule="auto"/>
+            </w:pPr>
+            <w:r>
+              <w:rPr>
+                <w:rFonts w:ascii="Courier New" w:hAnsi="Courier New"/>
+                <w:sz w:val="16"/>
+              </w:rPr>
+              <w:t>015  @dataclass</w:t>
+            </w:r>
+          </w:p>
+          <w:p>
+            <w:pPr>
+              <w:spacing w:after="0" w:line="240" w:lineRule="auto"/>
+            </w:pPr>
+            <w:r>
+              <w:rPr>
+                <w:rFonts w:ascii="Courier New" w:hAnsi="Courier New"/>
+                <w:sz w:val="16"/>
+              </w:rPr>
+              <w:t>016  class Request:</w:t>
+            </w:r>
+          </w:p>
+          <w:p>
+            <w:pPr>
+              <w:spacing w:after="0" w:line="240" w:lineRule="auto"/>
+            </w:pPr>
+            <w:r>
+              <w:rPr>
+                <w:rFonts w:ascii="Courier New" w:hAnsi="Courier New"/>
+                <w:sz w:val="16"/>
+              </w:rPr>
+              <w:t>017      method: str</w:t>
+            </w:r>
+          </w:p>
+          <w:p>
+            <w:pPr>
+              <w:spacing w:after="0" w:line="240" w:lineRule="auto"/>
+            </w:pPr>
+            <w:r>
+              <w:rPr>
+                <w:rFonts w:ascii="Courier New" w:hAnsi="Courier New"/>
+                <w:sz w:val="16"/>
+              </w:rPr>
+              <w:t>018      path: str</w:t>
+            </w:r>
+          </w:p>
+          <w:p>
+            <w:pPr>
+              <w:spacing w:after="0" w:line="240" w:lineRule="auto"/>
+            </w:pPr>
+            <w:r>
+              <w:rPr>
+                <w:rFonts w:ascii="Courier New" w:hAnsi="Courier New"/>
+                <w:sz w:val="16"/>
+              </w:rPr>
+              <w:t>019      version: str</w:t>
+            </w:r>
+          </w:p>
+          <w:p>
+            <w:pPr>
+              <w:spacing w:after="0" w:line="240" w:lineRule="auto"/>
+            </w:pPr>
+            <w:r>
+              <w:rPr>
+                <w:rFonts w:ascii="Courier New" w:hAnsi="Courier New"/>
+                <w:sz w:val="16"/>
+              </w:rPr>
+              <w:t xml:space="preserve">020  </w:t>
+            </w:r>
+          </w:p>
+          <w:p>
+            <w:pPr>
+              <w:spacing w:after="0" w:line="240" w:lineRule="auto"/>
+            </w:pPr>
+            <w:r>
+              <w:rPr>
+                <w:rFonts w:ascii="Courier New" w:hAnsi="Courier New"/>
+                <w:sz w:val="16"/>
+              </w:rPr>
+              <w:t xml:space="preserve">021  </w:t>
+            </w:r>
+          </w:p>
+          <w:p>
+            <w:pPr>
+              <w:spacing w:after="0" w:line="240" w:lineRule="auto"/>
+            </w:pPr>
+            <w:r>
+              <w:rPr>
+                <w:rFonts w:ascii="Courier New" w:hAnsi="Courier New"/>
+                <w:sz w:val="16"/>
+              </w:rPr>
+              <w:t>022  @dataclass</w:t>
+            </w:r>
+          </w:p>
+          <w:p>
+            <w:pPr>
+              <w:spacing w:after="0" w:line="240" w:lineRule="auto"/>
+            </w:pPr>
+            <w:r>
+              <w:rPr>
+                <w:rFonts w:ascii="Courier New" w:hAnsi="Courier New"/>
+                <w:sz w:val="16"/>
+              </w:rPr>
+              <w:t>023  class Response:</w:t>
+            </w:r>
+          </w:p>
+          <w:p>
+            <w:pPr>
+              <w:spacing w:after="0" w:line="240" w:lineRule="auto"/>
+            </w:pPr>
+            <w:r>
+              <w:rPr>
+                <w:rFonts w:ascii="Courier New" w:hAnsi="Courier New"/>
+                <w:sz w:val="16"/>
+              </w:rPr>
+              <w:t>024      status: int</w:t>
+            </w:r>
+          </w:p>
+          <w:p>
+            <w:pPr>
+              <w:spacing w:after="0" w:line="240" w:lineRule="auto"/>
+            </w:pPr>
+            <w:r>
+              <w:rPr>
+                <w:rFonts w:ascii="Courier New" w:hAnsi="Courier New"/>
+                <w:sz w:val="16"/>
+              </w:rPr>
+              <w:t>025      reason: str</w:t>
+            </w:r>
+          </w:p>
+          <w:p>
+            <w:pPr>
+              <w:spacing w:after="0" w:line="240" w:lineRule="auto"/>
+            </w:pPr>
+            <w:r>
+              <w:rPr>
+                <w:rFonts w:ascii="Courier New" w:hAnsi="Courier New"/>
+                <w:sz w:val="16"/>
+              </w:rPr>
+              <w:t>026      body: bytes</w:t>
+            </w:r>
+          </w:p>
+          <w:p>
+            <w:pPr>
+              <w:spacing w:after="0" w:line="240" w:lineRule="auto"/>
+            </w:pPr>
+            <w:r>
+              <w:rPr>
+                <w:rFonts w:ascii="Courier New" w:hAnsi="Courier New"/>
+                <w:sz w:val="16"/>
+              </w:rPr>
+              <w:t>027      content_type: str = "text/html; charset=utf-8"</w:t>
+            </w:r>
+          </w:p>
+          <w:p>
+            <w:pPr>
+              <w:spacing w:after="0" w:line="240" w:lineRule="auto"/>
+            </w:pPr>
+            <w:r>
+              <w:rPr>
+                <w:rFonts w:ascii="Courier New" w:hAnsi="Courier New"/>
+                <w:sz w:val="16"/>
+              </w:rPr>
+              <w:t xml:space="preserve">028  </w:t>
+            </w:r>
+          </w:p>
+          <w:p>
+            <w:pPr>
+              <w:spacing w:after="0" w:line="240" w:lineRule="auto"/>
+            </w:pPr>
+            <w:r>
+              <w:rPr>
+                <w:rFonts w:ascii="Courier New" w:hAnsi="Courier New"/>
+                <w:sz w:val="16"/>
+              </w:rPr>
+              <w:t xml:space="preserve">029  </w:t>
+            </w:r>
+          </w:p>
+          <w:p>
+            <w:pPr>
+              <w:spacing w:after="0" w:line="240" w:lineRule="auto"/>
+            </w:pPr>
+            <w:r>
+              <w:rPr>
+                <w:rFonts w:ascii="Courier New" w:hAnsi="Courier New"/>
+                <w:sz w:val="16"/>
+              </w:rPr>
+              <w:t>030  class SimpleHTTPServer:</w:t>
+            </w:r>
+          </w:p>
+          <w:p>
+            <w:pPr>
+              <w:spacing w:after="0" w:line="240" w:lineRule="auto"/>
+            </w:pPr>
+            <w:r>
+              <w:rPr>
+                <w:rFonts w:ascii="Courier New" w:hAnsi="Courier New"/>
+                <w:sz w:val="16"/>
+              </w:rPr>
+              <w:t>031      def __init__(self, host: str = "127.0.0.1", port: int = 8080) -&gt; None:</w:t>
+            </w:r>
+          </w:p>
+          <w:p>
+            <w:pPr>
+              <w:spacing w:after="0" w:line="240" w:lineRule="auto"/>
+            </w:pPr>
+            <w:r>
+              <w:rPr>
+                <w:rFonts w:ascii="Courier New" w:hAnsi="Courier New"/>
+                <w:sz w:val="16"/>
+              </w:rPr>
+              <w:t>032          self.host = host</w:t>
+            </w:r>
+          </w:p>
+          <w:p>
+            <w:pPr>
+              <w:spacing w:after="0" w:line="240" w:lineRule="auto"/>
+            </w:pPr>
+            <w:r>
+              <w:rPr>
+                <w:rFonts w:ascii="Courier New" w:hAnsi="Courier New"/>
+                <w:sz w:val="16"/>
+              </w:rPr>
+              <w:t>033          self.port = port</w:t>
+            </w:r>
+          </w:p>
+          <w:p>
+            <w:pPr>
+              <w:spacing w:after="0" w:line="240" w:lineRule="auto"/>
+            </w:pPr>
+            <w:r>
+              <w:rPr>
+                <w:rFonts w:ascii="Courier New" w:hAnsi="Courier New"/>
+                <w:sz w:val="16"/>
+              </w:rPr>
+              <w:t>034          self.public_dir = Path(__file__).resolve().parent / "public"</w:t>
+            </w:r>
+          </w:p>
+          <w:p>
+            <w:pPr>
+              <w:spacing w:after="0" w:line="240" w:lineRule="auto"/>
+            </w:pPr>
+            <w:r>
+              <w:rPr>
+                <w:rFonts w:ascii="Courier New" w:hAnsi="Courier New"/>
+                <w:sz w:val="16"/>
+              </w:rPr>
+              <w:t>035          self.routes: dict[str, Callable[[], Response]] = {</w:t>
+            </w:r>
+          </w:p>
+          <w:p>
+            <w:pPr>
+              <w:spacing w:after="0" w:line="240" w:lineRule="auto"/>
+            </w:pPr>
+            <w:r>
+              <w:rPr>
+                <w:rFonts w:ascii="Courier New" w:hAnsi="Courier New"/>
+                <w:sz w:val="16"/>
+              </w:rPr>
+              <w:t>036              "/": lambda: self._html_file("index.html"),</w:t>
+            </w:r>
+          </w:p>
+          <w:p>
+            <w:pPr>
+              <w:spacing w:after="0" w:line="240" w:lineRule="auto"/>
+            </w:pPr>
+            <w:r>
+              <w:rPr>
+                <w:rFonts w:ascii="Courier New" w:hAnsi="Courier New"/>
+                <w:sz w:val="16"/>
+              </w:rPr>
+              <w:t>037              "/about": lambda: self._html_file("about.html"),</w:t>
+            </w:r>
+          </w:p>
+          <w:p>
+            <w:pPr>
+              <w:spacing w:after="0" w:line="240" w:lineRule="auto"/>
+            </w:pPr>
+            <w:r>
+              <w:rPr>
+                <w:rFonts w:ascii="Courier New" w:hAnsi="Courier New"/>
+                <w:sz w:val="16"/>
+              </w:rPr>
+              <w:t>038          }</w:t>
+            </w:r>
+          </w:p>
+          <w:p>
+            <w:pPr>
+              <w:spacing w:after="0" w:line="240" w:lineRule="auto"/>
+            </w:pPr>
+            <w:r>
+              <w:rPr>
+                <w:rFonts w:ascii="Courier New" w:hAnsi="Courier New"/>
+                <w:sz w:val="16"/>
+              </w:rPr>
+              <w:t xml:space="preserve">039  </w:t>
+            </w:r>
+          </w:p>
+          <w:p>
+            <w:pPr>
+              <w:spacing w:after="0" w:line="240" w:lineRule="auto"/>
+            </w:pPr>
+            <w:r>
+              <w:rPr>
+                <w:rFonts w:ascii="Courier New" w:hAnsi="Courier New"/>
+                <w:sz w:val="16"/>
+              </w:rPr>
+              <w:t>040      def serve_forever(self) -&gt; None:</w:t>
+            </w:r>
+          </w:p>
+          <w:p>
+            <w:pPr>
+              <w:spacing w:after="0" w:line="240" w:lineRule="auto"/>
+            </w:pPr>
+            <w:r>
+              <w:rPr>
+                <w:rFonts w:ascii="Courier New" w:hAnsi="Courier New"/>
+                <w:sz w:val="16"/>
+              </w:rPr>
+              <w:t>041          with socket.socket(socket.AF_INET, socket.SOCK_STREAM) as server_socket:</w:t>
+            </w:r>
+          </w:p>
+          <w:p>
+            <w:pPr>
+              <w:spacing w:after="0" w:line="240" w:lineRule="auto"/>
+            </w:pPr>
+            <w:r>
+              <w:rPr>
+                <w:rFonts w:ascii="Courier New" w:hAnsi="Courier New"/>
+                <w:sz w:val="16"/>
+              </w:rPr>
+              <w:t>042              server_socket.setsockopt(socket.SOL_SOCKET, socket.SO_REUSEADDR, 1)</w:t>
+            </w:r>
+          </w:p>
+          <w:p>
+            <w:pPr>
+              <w:spacing w:after="0" w:line="240" w:lineRule="auto"/>
+            </w:pPr>
+            <w:r>
+              <w:rPr>
+                <w:rFonts w:ascii="Courier New" w:hAnsi="Courier New"/>
+                <w:sz w:val="16"/>
+              </w:rPr>
+              <w:t>043              server_socket.bind((self.host, self.port))</w:t>
+            </w:r>
+          </w:p>
+          <w:p>
+            <w:pPr>
+              <w:spacing w:after="0" w:line="240" w:lineRule="auto"/>
+            </w:pPr>
+            <w:r>
+              <w:rPr>
+                <w:rFonts w:ascii="Courier New" w:hAnsi="Courier New"/>
+                <w:sz w:val="16"/>
+              </w:rPr>
+              <w:t>044              server_socket.listen()</w:t>
+            </w:r>
+          </w:p>
+          <w:p>
+            <w:pPr>
+              <w:spacing w:after="0" w:line="240" w:lineRule="auto"/>
+            </w:pPr>
+            <w:r>
+              <w:rPr>
+                <w:rFonts w:ascii="Courier New" w:hAnsi="Courier New"/>
+                <w:sz w:val="16"/>
+              </w:rPr>
+              <w:t xml:space="preserve">045  </w:t>
+            </w:r>
+          </w:p>
+          <w:p>
+            <w:pPr>
+              <w:spacing w:after="0" w:line="240" w:lineRule="auto"/>
+            </w:pPr>
+            <w:r>
+              <w:rPr>
+                <w:rFonts w:ascii="Courier New" w:hAnsi="Courier New"/>
+                <w:sz w:val="16"/>
+              </w:rPr>
+              <w:t>046              print(f"Server started on http://{self.host}:{self.port}")</w:t>
+            </w:r>
+          </w:p>
+          <w:p>
+            <w:pPr>
+              <w:spacing w:after="0" w:line="240" w:lineRule="auto"/>
+            </w:pPr>
+            <w:r>
+              <w:rPr>
+                <w:rFonts w:ascii="Courier New" w:hAnsi="Courier New"/>
+                <w:sz w:val="16"/>
+              </w:rPr>
+              <w:t>047              print("Press Ctrl+C to stop.")</w:t>
+            </w:r>
+          </w:p>
+          <w:p>
+            <w:pPr>
+              <w:spacing w:after="0" w:line="240" w:lineRule="auto"/>
+            </w:pPr>
+            <w:r>
+              <w:rPr>
+                <w:rFonts w:ascii="Courier New" w:hAnsi="Courier New"/>
+                <w:sz w:val="16"/>
+              </w:rPr>
+              <w:t xml:space="preserve">048  </w:t>
+            </w:r>
+          </w:p>
+          <w:p>
+            <w:pPr>
+              <w:spacing w:after="0" w:line="240" w:lineRule="auto"/>
+            </w:pPr>
+            <w:r>
+              <w:rPr>
+                <w:rFonts w:ascii="Courier New" w:hAnsi="Courier New"/>
+                <w:sz w:val="16"/>
+              </w:rPr>
+              <w:t>049              while True:</w:t>
+            </w:r>
+          </w:p>
+          <w:p>
+            <w:pPr>
+              <w:spacing w:after="0" w:line="240" w:lineRule="auto"/>
+            </w:pPr>
+            <w:r>
+              <w:rPr>
+                <w:rFonts w:ascii="Courier New" w:hAnsi="Courier New"/>
+                <w:sz w:val="16"/>
+              </w:rPr>
+              <w:t>050                  client_socket, client_address = server_socket.accept()</w:t>
+            </w:r>
+          </w:p>
+          <w:p>
+            <w:pPr>
+              <w:spacing w:after="0" w:line="240" w:lineRule="auto"/>
+            </w:pPr>
+            <w:r>
+              <w:rPr>
+                <w:rFonts w:ascii="Courier New" w:hAnsi="Courier New"/>
+                <w:sz w:val="16"/>
+              </w:rPr>
+              <w:t>051                  with client_socket:</w:t>
+            </w:r>
+          </w:p>
+          <w:p>
+            <w:pPr>
+              <w:spacing w:after="0" w:line="240" w:lineRule="auto"/>
+            </w:pPr>
+            <w:r>
+              <w:rPr>
+                <w:rFonts w:ascii="Courier New" w:hAnsi="Courier New"/>
+                <w:sz w:val="16"/>
+              </w:rPr>
+              <w:t>052                      self._handle_client(client_socket, client_address[0])</w:t>
+            </w:r>
+          </w:p>
+          <w:p>
+            <w:pPr>
+              <w:spacing w:after="0" w:line="240" w:lineRule="auto"/>
+            </w:pPr>
+            <w:r>
+              <w:rPr>
+                <w:rFonts w:ascii="Courier New" w:hAnsi="Courier New"/>
+                <w:sz w:val="16"/>
+              </w:rPr>
+              <w:t xml:space="preserve">053  </w:t>
+            </w:r>
+          </w:p>
+          <w:p>
+            <w:pPr>
+              <w:spacing w:after="0" w:line="240" w:lineRule="auto"/>
+            </w:pPr>
+            <w:r>
+              <w:rPr>
+                <w:rFonts w:ascii="Courier New" w:hAnsi="Courier New"/>
+                <w:sz w:val="16"/>
+              </w:rPr>
+              <w:t>054      def _handle_client(self, client_socket: socket.socket, client_ip: str) -&gt; None:</w:t>
+            </w:r>
+          </w:p>
+          <w:p>
+            <w:pPr>
+              <w:spacing w:after="0" w:line="240" w:lineRule="auto"/>
+            </w:pPr>
+            <w:r>
+              <w:rPr>
+                <w:rFonts w:ascii="Courier New" w:hAnsi="Courier New"/>
+                <w:sz w:val="16"/>
+              </w:rPr>
+              <w:t>055          raw_request = client_socket.recv(4096)</w:t>
+            </w:r>
+          </w:p>
+          <w:p>
+            <w:pPr>
+              <w:spacing w:after="0" w:line="240" w:lineRule="auto"/>
+            </w:pPr>
+            <w:r>
+              <w:rPr>
+                <w:rFonts w:ascii="Courier New" w:hAnsi="Courier New"/>
+                <w:sz w:val="16"/>
+              </w:rPr>
+              <w:t>056          request = self._parse_request(raw_request)</w:t>
+            </w:r>
+          </w:p>
+          <w:p>
+            <w:pPr>
+              <w:spacing w:after="0" w:line="240" w:lineRule="auto"/>
+            </w:pPr>
+            <w:r>
+              <w:rPr>
+                <w:rFonts w:ascii="Courier New" w:hAnsi="Courier New"/>
+                <w:sz w:val="16"/>
+              </w:rPr>
+              <w:t xml:space="preserve">057  </w:t>
+            </w:r>
+          </w:p>
+          <w:p>
+            <w:pPr>
+              <w:spacing w:after="0" w:line="240" w:lineRule="auto"/>
+            </w:pPr>
+            <w:r>
+              <w:rPr>
+                <w:rFonts w:ascii="Courier New" w:hAnsi="Courier New"/>
+                <w:sz w:val="16"/>
+              </w:rPr>
+              <w:t>058          if request is None:</w:t>
+            </w:r>
+          </w:p>
+          <w:p>
+            <w:pPr>
+              <w:spacing w:after="0" w:line="240" w:lineRule="auto"/>
+            </w:pPr>
+            <w:r>
+              <w:rPr>
+                <w:rFonts w:ascii="Courier New" w:hAnsi="Courier New"/>
+                <w:sz w:val="16"/>
+              </w:rPr>
+              <w:t>059              response = self._plain_text(400, "Bad Request", "Bad Request")</w:t>
+            </w:r>
+          </w:p>
+          <w:p>
+            <w:pPr>
+              <w:spacing w:after="0" w:line="240" w:lineRule="auto"/>
+            </w:pPr>
+            <w:r>
+              <w:rPr>
+                <w:rFonts w:ascii="Courier New" w:hAnsi="Courier New"/>
+                <w:sz w:val="16"/>
+              </w:rPr>
+              <w:t>060              log_method = "-"</w:t>
+            </w:r>
+          </w:p>
+          <w:p>
+            <w:pPr>
+              <w:spacing w:after="0" w:line="240" w:lineRule="auto"/>
+            </w:pPr>
+            <w:r>
+              <w:rPr>
+                <w:rFonts w:ascii="Courier New" w:hAnsi="Courier New"/>
+                <w:sz w:val="16"/>
+              </w:rPr>
+              <w:t>061              log_path = "-"</w:t>
+            </w:r>
+          </w:p>
+          <w:p>
+            <w:pPr>
+              <w:spacing w:after="0" w:line="240" w:lineRule="auto"/>
+            </w:pPr>
+            <w:r>
+              <w:rPr>
+                <w:rFonts w:ascii="Courier New" w:hAnsi="Courier New"/>
+                <w:sz w:val="16"/>
+              </w:rPr>
+              <w:t>062          elif request.method != "GET":</w:t>
+            </w:r>
+          </w:p>
+          <w:p>
+            <w:pPr>
+              <w:spacing w:after="0" w:line="240" w:lineRule="auto"/>
+            </w:pPr>
+            <w:r>
+              <w:rPr>
+                <w:rFonts w:ascii="Courier New" w:hAnsi="Courier New"/>
+                <w:sz w:val="16"/>
+              </w:rPr>
+              <w:t>063              response = self._plain_text(405, "Method Not Allowed", "Method Not Allowed")</w:t>
+            </w:r>
+          </w:p>
+          <w:p>
+            <w:pPr>
+              <w:spacing w:after="0" w:line="240" w:lineRule="auto"/>
+            </w:pPr>
+            <w:r>
+              <w:rPr>
+                <w:rFonts w:ascii="Courier New" w:hAnsi="Courier New"/>
+                <w:sz w:val="16"/>
+              </w:rPr>
+              <w:t>064              log_method = request.method</w:t>
+            </w:r>
+          </w:p>
+          <w:p>
+            <w:pPr>
+              <w:spacing w:after="0" w:line="240" w:lineRule="auto"/>
+            </w:pPr>
+            <w:r>
+              <w:rPr>
+                <w:rFonts w:ascii="Courier New" w:hAnsi="Courier New"/>
+                <w:sz w:val="16"/>
+              </w:rPr>
+              <w:t>065              log_path = request.path</w:t>
+            </w:r>
+          </w:p>
+          <w:p>
+            <w:pPr>
+              <w:spacing w:after="0" w:line="240" w:lineRule="auto"/>
+            </w:pPr>
+            <w:r>
+              <w:rPr>
+                <w:rFonts w:ascii="Courier New" w:hAnsi="Courier New"/>
+                <w:sz w:val="16"/>
+              </w:rPr>
+              <w:t>066          else:</w:t>
+            </w:r>
+          </w:p>
+          <w:p>
+            <w:pPr>
+              <w:spacing w:after="0" w:line="240" w:lineRule="auto"/>
+            </w:pPr>
+            <w:r>
+              <w:rPr>
+                <w:rFonts w:ascii="Courier New" w:hAnsi="Courier New"/>
+                <w:sz w:val="16"/>
+              </w:rPr>
+              <w:t>067              response = self._route(request.path)</w:t>
+            </w:r>
+          </w:p>
+          <w:p>
+            <w:pPr>
+              <w:spacing w:after="0" w:line="240" w:lineRule="auto"/>
+            </w:pPr>
+            <w:r>
+              <w:rPr>
+                <w:rFonts w:ascii="Courier New" w:hAnsi="Courier New"/>
+                <w:sz w:val="16"/>
+              </w:rPr>
+              <w:t>068              log_method = request.method</w:t>
+            </w:r>
+          </w:p>
+          <w:p>
+            <w:pPr>
+              <w:spacing w:after="0" w:line="240" w:lineRule="auto"/>
+            </w:pPr>
+            <w:r>
+              <w:rPr>
+                <w:rFonts w:ascii="Courier New" w:hAnsi="Courier New"/>
+                <w:sz w:val="16"/>
+              </w:rPr>
+              <w:t>069              log_path = request.path</w:t>
+            </w:r>
+          </w:p>
+          <w:p>
+            <w:pPr>
+              <w:spacing w:after="0" w:line="240" w:lineRule="auto"/>
+            </w:pPr>
+            <w:r>
+              <w:rPr>
+                <w:rFonts w:ascii="Courier New" w:hAnsi="Courier New"/>
+                <w:sz w:val="16"/>
+              </w:rPr>
+              <w:t xml:space="preserve">070  </w:t>
+            </w:r>
+          </w:p>
+          <w:p>
+            <w:pPr>
+              <w:spacing w:after="0" w:line="240" w:lineRule="auto"/>
+            </w:pPr>
+            <w:r>
+              <w:rPr>
+                <w:rFonts w:ascii="Courier New" w:hAnsi="Courier New"/>
+                <w:sz w:val="16"/>
+              </w:rPr>
+              <w:t>071          client_socket.sendall(self._build_response(response))</w:t>
+            </w:r>
+          </w:p>
+          <w:p>
+            <w:pPr>
+              <w:spacing w:after="0" w:line="240" w:lineRule="auto"/>
+            </w:pPr>
+            <w:r>
+              <w:rPr>
+                <w:rFonts w:ascii="Courier New" w:hAnsi="Courier New"/>
+                <w:sz w:val="16"/>
+              </w:rPr>
+              <w:t>072          self._log(client_ip, log_method, log_path, response.status)</w:t>
+            </w:r>
+          </w:p>
+          <w:p>
+            <w:pPr>
+              <w:spacing w:after="0" w:line="240" w:lineRule="auto"/>
+            </w:pPr>
+            <w:r>
+              <w:rPr>
+                <w:rFonts w:ascii="Courier New" w:hAnsi="Courier New"/>
+                <w:sz w:val="16"/>
+              </w:rPr>
+              <w:t xml:space="preserve">073  </w:t>
+            </w:r>
+          </w:p>
+          <w:p>
+            <w:pPr>
+              <w:spacing w:after="0" w:line="240" w:lineRule="auto"/>
+            </w:pPr>
+            <w:r>
+              <w:rPr>
+                <w:rFonts w:ascii="Courier New" w:hAnsi="Courier New"/>
+                <w:sz w:val="16"/>
+              </w:rPr>
+              <w:t>074      def _parse_request(self, raw_request: bytes) -&gt; Request | None:</w:t>
+            </w:r>
+          </w:p>
+          <w:p>
+            <w:pPr>
+              <w:spacing w:after="0" w:line="240" w:lineRule="auto"/>
+            </w:pPr>
+            <w:r>
+              <w:rPr>
+                <w:rFonts w:ascii="Courier New" w:hAnsi="Courier New"/>
+                <w:sz w:val="16"/>
+              </w:rPr>
+              <w:t>075          try:</w:t>
+            </w:r>
+          </w:p>
+          <w:p>
+            <w:pPr>
+              <w:spacing w:after="0" w:line="240" w:lineRule="auto"/>
+            </w:pPr>
+            <w:r>
+              <w:rPr>
+                <w:rFonts w:ascii="Courier New" w:hAnsi="Courier New"/>
+                <w:sz w:val="16"/>
+              </w:rPr>
+              <w:t>076              first_line = raw_request.decode("iso-8859-1").splitlines()[0]</w:t>
+            </w:r>
+          </w:p>
+          <w:p>
+            <w:pPr>
+              <w:spacing w:after="0" w:line="240" w:lineRule="auto"/>
+            </w:pPr>
+            <w:r>
+              <w:rPr>
+                <w:rFonts w:ascii="Courier New" w:hAnsi="Courier New"/>
+                <w:sz w:val="16"/>
+              </w:rPr>
+              <w:t>077              method, path, version = first_line.split()</w:t>
+            </w:r>
+          </w:p>
+          <w:p>
+            <w:pPr>
+              <w:spacing w:after="0" w:line="240" w:lineRule="auto"/>
+            </w:pPr>
+            <w:r>
+              <w:rPr>
+                <w:rFonts w:ascii="Courier New" w:hAnsi="Courier New"/>
+                <w:sz w:val="16"/>
+              </w:rPr>
+              <w:t>078          except (IndexError, ValueError, UnicodeDecodeError):</w:t>
+            </w:r>
+          </w:p>
+          <w:p>
+            <w:pPr>
+              <w:spacing w:after="0" w:line="240" w:lineRule="auto"/>
+            </w:pPr>
+            <w:r>
+              <w:rPr>
+                <w:rFonts w:ascii="Courier New" w:hAnsi="Courier New"/>
+                <w:sz w:val="16"/>
+              </w:rPr>
+              <w:t>079              return None</w:t>
+            </w:r>
+          </w:p>
+          <w:p>
+            <w:pPr>
+              <w:spacing w:after="0" w:line="240" w:lineRule="auto"/>
+            </w:pPr>
+            <w:r>
+              <w:rPr>
+                <w:rFonts w:ascii="Courier New" w:hAnsi="Courier New"/>
+                <w:sz w:val="16"/>
+              </w:rPr>
+              <w:t xml:space="preserve">080  </w:t>
+            </w:r>
+          </w:p>
+          <w:p>
+            <w:pPr>
+              <w:spacing w:after="0" w:line="240" w:lineRule="auto"/>
+            </w:pPr>
+            <w:r>
+              <w:rPr>
+                <w:rFonts w:ascii="Courier New" w:hAnsi="Courier New"/>
+                <w:sz w:val="16"/>
+              </w:rPr>
+              <w:t>081          return Request(method=method.upper(), path=path, version=version)</w:t>
+            </w:r>
+          </w:p>
+          <w:p>
+            <w:pPr>
+              <w:spacing w:after="0" w:line="240" w:lineRule="auto"/>
+            </w:pPr>
+            <w:r>
+              <w:rPr>
+                <w:rFonts w:ascii="Courier New" w:hAnsi="Courier New"/>
+                <w:sz w:val="16"/>
+              </w:rPr>
+              <w:t xml:space="preserve">082  </w:t>
+            </w:r>
+          </w:p>
+          <w:p>
+            <w:pPr>
+              <w:spacing w:after="0" w:line="240" w:lineRule="auto"/>
+            </w:pPr>
+            <w:r>
+              <w:rPr>
+                <w:rFonts w:ascii="Courier New" w:hAnsi="Courier New"/>
+                <w:sz w:val="16"/>
+              </w:rPr>
+              <w:t>083      def _route(self, raw_path: str) -&gt; Response:</w:t>
+            </w:r>
+          </w:p>
+          <w:p>
+            <w:pPr>
+              <w:spacing w:after="0" w:line="240" w:lineRule="auto"/>
+            </w:pPr>
+            <w:r>
+              <w:rPr>
+                <w:rFonts w:ascii="Courier New" w:hAnsi="Courier New"/>
+                <w:sz w:val="16"/>
+              </w:rPr>
+              <w:t>084          path = unquote(raw_path.split("?", 1)[0])</w:t>
+            </w:r>
+          </w:p>
+          <w:p>
+            <w:pPr>
+              <w:spacing w:after="0" w:line="240" w:lineRule="auto"/>
+            </w:pPr>
+            <w:r>
+              <w:rPr>
+                <w:rFonts w:ascii="Courier New" w:hAnsi="Courier New"/>
+                <w:sz w:val="16"/>
+              </w:rPr>
+              <w:t xml:space="preserve">085  </w:t>
+            </w:r>
+          </w:p>
+          <w:p>
+            <w:pPr>
+              <w:spacing w:after="0" w:line="240" w:lineRule="auto"/>
+            </w:pPr>
+            <w:r>
+              <w:rPr>
+                <w:rFonts w:ascii="Courier New" w:hAnsi="Courier New"/>
+                <w:sz w:val="16"/>
+              </w:rPr>
+              <w:t>086          if path in self.routes:</w:t>
+            </w:r>
+          </w:p>
+          <w:p>
+            <w:pPr>
+              <w:spacing w:after="0" w:line="240" w:lineRule="auto"/>
+            </w:pPr>
+            <w:r>
+              <w:rPr>
+                <w:rFonts w:ascii="Courier New" w:hAnsi="Courier New"/>
+                <w:sz w:val="16"/>
+              </w:rPr>
+              <w:t>087              return self.routes[path]()</w:t>
+            </w:r>
+          </w:p>
+          <w:p>
+            <w:pPr>
+              <w:spacing w:after="0" w:line="240" w:lineRule="auto"/>
+            </w:pPr>
+            <w:r>
+              <w:rPr>
+                <w:rFonts w:ascii="Courier New" w:hAnsi="Courier New"/>
+                <w:sz w:val="16"/>
+              </w:rPr>
+              <w:t xml:space="preserve">088  </w:t>
+            </w:r>
+          </w:p>
+          <w:p>
+            <w:pPr>
+              <w:spacing w:after="0" w:line="240" w:lineRule="auto"/>
+            </w:pPr>
+            <w:r>
+              <w:rPr>
+                <w:rFonts w:ascii="Courier New" w:hAnsi="Courier New"/>
+                <w:sz w:val="16"/>
+              </w:rPr>
+              <w:t>089          if path.startswith("/static/"):</w:t>
+            </w:r>
+          </w:p>
+          <w:p>
+            <w:pPr>
+              <w:spacing w:after="0" w:line="240" w:lineRule="auto"/>
+            </w:pPr>
+            <w:r>
+              <w:rPr>
+                <w:rFonts w:ascii="Courier New" w:hAnsi="Courier New"/>
+                <w:sz w:val="16"/>
+              </w:rPr>
+              <w:t>090              relative_path = path.removeprefix("/static/")</w:t>
+            </w:r>
+          </w:p>
+          <w:p>
+            <w:pPr>
+              <w:spacing w:after="0" w:line="240" w:lineRule="auto"/>
+            </w:pPr>
+            <w:r>
+              <w:rPr>
+                <w:rFonts w:ascii="Courier New" w:hAnsi="Courier New"/>
+                <w:sz w:val="16"/>
+              </w:rPr>
+              <w:t>091              return self._static_file(relative_path)</w:t>
+            </w:r>
+          </w:p>
+          <w:p>
+            <w:pPr>
+              <w:spacing w:after="0" w:line="240" w:lineRule="auto"/>
+            </w:pPr>
+            <w:r>
+              <w:rPr>
+                <w:rFonts w:ascii="Courier New" w:hAnsi="Courier New"/>
+                <w:sz w:val="16"/>
+              </w:rPr>
+              <w:t xml:space="preserve">092  </w:t>
+            </w:r>
+          </w:p>
+          <w:p>
+            <w:pPr>
+              <w:spacing w:after="0" w:line="240" w:lineRule="auto"/>
+            </w:pPr>
+            <w:r>
+              <w:rPr>
+                <w:rFonts w:ascii="Courier New" w:hAnsi="Courier New"/>
+                <w:sz w:val="16"/>
+              </w:rPr>
+              <w:t>093          return self._html_file("404.html", status=404, reason="Not Found")</w:t>
+            </w:r>
+          </w:p>
+          <w:p>
+            <w:pPr>
+              <w:spacing w:after="0" w:line="240" w:lineRule="auto"/>
+            </w:pPr>
+            <w:r>
+              <w:rPr>
+                <w:rFonts w:ascii="Courier New" w:hAnsi="Courier New"/>
+                <w:sz w:val="16"/>
+              </w:rPr>
+              <w:t xml:space="preserve">094  </w:t>
+            </w:r>
+          </w:p>
+          <w:p>
+            <w:pPr>
+              <w:spacing w:after="0" w:line="240" w:lineRule="auto"/>
+            </w:pPr>
+            <w:r>
+              <w:rPr>
+                <w:rFonts w:ascii="Courier New" w:hAnsi="Courier New"/>
+                <w:sz w:val="16"/>
+              </w:rPr>
+              <w:t>095      def _html_file(self, filename: str, status: int = 200, reason: str = "OK") -&gt; Response:</w:t>
+            </w:r>
+          </w:p>
+          <w:p>
+            <w:pPr>
+              <w:spacing w:after="0" w:line="240" w:lineRule="auto"/>
+            </w:pPr>
+            <w:r>
+              <w:rPr>
+                <w:rFonts w:ascii="Courier New" w:hAnsi="Courier New"/>
+                <w:sz w:val="16"/>
+              </w:rPr>
+              <w:t>096          file_path = self.public_dir / filename</w:t>
+            </w:r>
+          </w:p>
+          <w:p>
+            <w:pPr>
+              <w:spacing w:after="0" w:line="240" w:lineRule="auto"/>
+            </w:pPr>
+            <w:r>
+              <w:rPr>
+                <w:rFonts w:ascii="Courier New" w:hAnsi="Courier New"/>
+                <w:sz w:val="16"/>
+              </w:rPr>
+              <w:t xml:space="preserve">097  </w:t>
+            </w:r>
+          </w:p>
+          <w:p>
+            <w:pPr>
+              <w:spacing w:after="0" w:line="240" w:lineRule="auto"/>
+            </w:pPr>
+            <w:r>
+              <w:rPr>
+                <w:rFonts w:ascii="Courier New" w:hAnsi="Courier New"/>
+                <w:sz w:val="16"/>
+              </w:rPr>
+              <w:t>098          if not file_path.exists():</w:t>
+            </w:r>
+          </w:p>
+          <w:p>
+            <w:pPr>
+              <w:spacing w:after="0" w:line="240" w:lineRule="auto"/>
+            </w:pPr>
+            <w:r>
+              <w:rPr>
+                <w:rFonts w:ascii="Courier New" w:hAnsi="Courier New"/>
+                <w:sz w:val="16"/>
+              </w:rPr>
+              <w:t>099              return self._plain_text(500, "Internal Server Error", f"Missing file: {filename}")</w:t>
+            </w:r>
+          </w:p>
+          <w:p>
+            <w:pPr>
+              <w:spacing w:after="0" w:line="240" w:lineRule="auto"/>
+            </w:pPr>
+            <w:r>
+              <w:rPr>
+                <w:rFonts w:ascii="Courier New" w:hAnsi="Courier New"/>
+                <w:sz w:val="16"/>
+              </w:rPr>
+              <w:t xml:space="preserve">100  </w:t>
+            </w:r>
+          </w:p>
+          <w:p>
+            <w:pPr>
+              <w:spacing w:after="0" w:line="240" w:lineRule="auto"/>
+            </w:pPr>
+            <w:r>
+              <w:rPr>
+                <w:rFonts w:ascii="Courier New" w:hAnsi="Courier New"/>
+                <w:sz w:val="16"/>
+              </w:rPr>
+              <w:t>101          return Response(</w:t>
+            </w:r>
+          </w:p>
+          <w:p>
+            <w:pPr>
+              <w:spacing w:after="0" w:line="240" w:lineRule="auto"/>
+            </w:pPr>
+            <w:r>
+              <w:rPr>
+                <w:rFonts w:ascii="Courier New" w:hAnsi="Courier New"/>
+                <w:sz w:val="16"/>
+              </w:rPr>
+              <w:t>102              status=status,</w:t>
+            </w:r>
+          </w:p>
+          <w:p>
+            <w:pPr>
+              <w:spacing w:after="0" w:line="240" w:lineRule="auto"/>
+            </w:pPr>
+            <w:r>
+              <w:rPr>
+                <w:rFonts w:ascii="Courier New" w:hAnsi="Courier New"/>
+                <w:sz w:val="16"/>
+              </w:rPr>
+              <w:t>103              reason=reason,</w:t>
+            </w:r>
+          </w:p>
+          <w:p>
+            <w:pPr>
+              <w:spacing w:after="0" w:line="240" w:lineRule="auto"/>
+            </w:pPr>
+            <w:r>
+              <w:rPr>
+                <w:rFonts w:ascii="Courier New" w:hAnsi="Courier New"/>
+                <w:sz w:val="16"/>
+              </w:rPr>
+              <w:t>104              body=file_path.read_bytes(),</w:t>
+            </w:r>
+          </w:p>
+          <w:p>
+            <w:pPr>
+              <w:spacing w:after="0" w:line="240" w:lineRule="auto"/>
+            </w:pPr>
+            <w:r>
+              <w:rPr>
+                <w:rFonts w:ascii="Courier New" w:hAnsi="Courier New"/>
+                <w:sz w:val="16"/>
+              </w:rPr>
+              <w:t>105              content_type="text/html; charset=utf-8",</w:t>
+            </w:r>
+          </w:p>
+          <w:p>
+            <w:pPr>
+              <w:spacing w:after="0" w:line="240" w:lineRule="auto"/>
+            </w:pPr>
+            <w:r>
+              <w:rPr>
+                <w:rFonts w:ascii="Courier New" w:hAnsi="Courier New"/>
+                <w:sz w:val="16"/>
+              </w:rPr>
+              <w:t>106          )</w:t>
+            </w:r>
+          </w:p>
+          <w:p>
+            <w:pPr>
+              <w:spacing w:after="0" w:line="240" w:lineRule="auto"/>
+            </w:pPr>
+            <w:r>
+              <w:rPr>
+                <w:rFonts w:ascii="Courier New" w:hAnsi="Courier New"/>
+                <w:sz w:val="16"/>
+              </w:rPr>
+              <w:t xml:space="preserve">107  </w:t>
+            </w:r>
+          </w:p>
+          <w:p>
+            <w:pPr>
+              <w:spacing w:after="0" w:line="240" w:lineRule="auto"/>
+            </w:pPr>
+            <w:r>
+              <w:rPr>
+                <w:rFonts w:ascii="Courier New" w:hAnsi="Courier New"/>
+                <w:sz w:val="16"/>
+              </w:rPr>
+              <w:t>108      def _static_file(self, relative_path: str) -&gt; Response:</w:t>
+            </w:r>
+          </w:p>
+          <w:p>
+            <w:pPr>
+              <w:spacing w:after="0" w:line="240" w:lineRule="auto"/>
+            </w:pPr>
+            <w:r>
+              <w:rPr>
+                <w:rFonts w:ascii="Courier New" w:hAnsi="Courier New"/>
+                <w:sz w:val="16"/>
+              </w:rPr>
+              <w:t>109          requested = (self.public_dir / relative_path).resolve()</w:t>
+            </w:r>
+          </w:p>
+          <w:p>
+            <w:pPr>
+              <w:spacing w:after="0" w:line="240" w:lineRule="auto"/>
+            </w:pPr>
+            <w:r>
+              <w:rPr>
+                <w:rFonts w:ascii="Courier New" w:hAnsi="Courier New"/>
+                <w:sz w:val="16"/>
+              </w:rPr>
+              <w:t xml:space="preserve">110  </w:t>
+            </w:r>
+          </w:p>
+          <w:p>
+            <w:pPr>
+              <w:spacing w:after="0" w:line="240" w:lineRule="auto"/>
+            </w:pPr>
+            <w:r>
+              <w:rPr>
+                <w:rFonts w:ascii="Courier New" w:hAnsi="Courier New"/>
+                <w:sz w:val="16"/>
+              </w:rPr>
+              <w:t>111          if not self._is_inside_public(requested) or not requested.is_file():</w:t>
+            </w:r>
+          </w:p>
+          <w:p>
+            <w:pPr>
+              <w:spacing w:after="0" w:line="240" w:lineRule="auto"/>
+            </w:pPr>
+            <w:r>
+              <w:rPr>
+                <w:rFonts w:ascii="Courier New" w:hAnsi="Courier New"/>
+                <w:sz w:val="16"/>
+              </w:rPr>
+              <w:t>112              return self._html_file("404.html", status=404, reason="Not Found")</w:t>
+            </w:r>
+          </w:p>
+          <w:p>
+            <w:pPr>
+              <w:spacing w:after="0" w:line="240" w:lineRule="auto"/>
+            </w:pPr>
+            <w:r>
+              <w:rPr>
+                <w:rFonts w:ascii="Courier New" w:hAnsi="Courier New"/>
+                <w:sz w:val="16"/>
+              </w:rPr>
+              <w:t xml:space="preserve">113  </w:t>
+            </w:r>
+          </w:p>
+          <w:p>
+            <w:pPr>
+              <w:spacing w:after="0" w:line="240" w:lineRule="auto"/>
+            </w:pPr>
+            <w:r>
+              <w:rPr>
+                <w:rFonts w:ascii="Courier New" w:hAnsi="Courier New"/>
+                <w:sz w:val="16"/>
+              </w:rPr>
+              <w:t>114          content_type, _ = mimetypes.guess_type(requested.name)</w:t>
+            </w:r>
+          </w:p>
+          <w:p>
+            <w:pPr>
+              <w:spacing w:after="0" w:line="240" w:lineRule="auto"/>
+            </w:pPr>
+            <w:r>
+              <w:rPr>
+                <w:rFonts w:ascii="Courier New" w:hAnsi="Courier New"/>
+                <w:sz w:val="16"/>
+              </w:rPr>
+              <w:t>115          return Response(</w:t>
+            </w:r>
+          </w:p>
+          <w:p>
+            <w:pPr>
+              <w:spacing w:after="0" w:line="240" w:lineRule="auto"/>
+            </w:pPr>
+            <w:r>
+              <w:rPr>
+                <w:rFonts w:ascii="Courier New" w:hAnsi="Courier New"/>
+                <w:sz w:val="16"/>
+              </w:rPr>
+              <w:t>116              status=200,</w:t>
+            </w:r>
+          </w:p>
+          <w:p>
+            <w:pPr>
+              <w:spacing w:after="0" w:line="240" w:lineRule="auto"/>
+            </w:pPr>
+            <w:r>
+              <w:rPr>
+                <w:rFonts w:ascii="Courier New" w:hAnsi="Courier New"/>
+                <w:sz w:val="16"/>
+              </w:rPr>
+              <w:t>117              reason="OK",</w:t>
+            </w:r>
+          </w:p>
+          <w:p>
+            <w:pPr>
+              <w:spacing w:after="0" w:line="240" w:lineRule="auto"/>
+            </w:pPr>
+            <w:r>
+              <w:rPr>
+                <w:rFonts w:ascii="Courier New" w:hAnsi="Courier New"/>
+                <w:sz w:val="16"/>
+              </w:rPr>
+              <w:t>118              body=requested.read_bytes(),</w:t>
+            </w:r>
+          </w:p>
+          <w:p>
+            <w:pPr>
+              <w:spacing w:after="0" w:line="240" w:lineRule="auto"/>
+            </w:pPr>
+            <w:r>
+              <w:rPr>
+                <w:rFonts w:ascii="Courier New" w:hAnsi="Courier New"/>
+                <w:sz w:val="16"/>
+              </w:rPr>
+              <w:t>119              content_type=content_type or "application/octet-stream",</w:t>
+            </w:r>
+          </w:p>
+          <w:p>
+            <w:pPr>
+              <w:spacing w:after="0" w:line="240" w:lineRule="auto"/>
+            </w:pPr>
+            <w:r>
+              <w:rPr>
+                <w:rFonts w:ascii="Courier New" w:hAnsi="Courier New"/>
+                <w:sz w:val="16"/>
+              </w:rPr>
+              <w:t>120          )</w:t>
+            </w:r>
+          </w:p>
+          <w:p>
+            <w:pPr>
+              <w:spacing w:after="0" w:line="240" w:lineRule="auto"/>
+            </w:pPr>
+            <w:r>
+              <w:rPr>
+                <w:rFonts w:ascii="Courier New" w:hAnsi="Courier New"/>
+                <w:sz w:val="16"/>
+              </w:rPr>
+              <w:t xml:space="preserve">121  </w:t>
+            </w:r>
+          </w:p>
+          <w:p>
+            <w:pPr>
+              <w:spacing w:after="0" w:line="240" w:lineRule="auto"/>
+            </w:pPr>
+            <w:r>
+              <w:rPr>
+                <w:rFonts w:ascii="Courier New" w:hAnsi="Courier New"/>
+                <w:sz w:val="16"/>
+              </w:rPr>
+              <w:t>122      def _is_inside_public(self, file_path: Path) -&gt; bool:</w:t>
+            </w:r>
+          </w:p>
+          <w:p>
+            <w:pPr>
+              <w:spacing w:after="0" w:line="240" w:lineRule="auto"/>
+            </w:pPr>
+            <w:r>
+              <w:rPr>
+                <w:rFonts w:ascii="Courier New" w:hAnsi="Courier New"/>
+                <w:sz w:val="16"/>
+              </w:rPr>
+              <w:t>123          public_root = self.public_dir.resolve()</w:t>
+            </w:r>
+          </w:p>
+          <w:p>
+            <w:pPr>
+              <w:spacing w:after="0" w:line="240" w:lineRule="auto"/>
+            </w:pPr>
+            <w:r>
+              <w:rPr>
+                <w:rFonts w:ascii="Courier New" w:hAnsi="Courier New"/>
+                <w:sz w:val="16"/>
+              </w:rPr>
+              <w:t>124          return file_path == public_root or public_root in file_path.parents</w:t>
+            </w:r>
+          </w:p>
+          <w:p>
+            <w:pPr>
+              <w:spacing w:after="0" w:line="240" w:lineRule="auto"/>
+            </w:pPr>
+            <w:r>
+              <w:rPr>
+                <w:rFonts w:ascii="Courier New" w:hAnsi="Courier New"/>
+                <w:sz w:val="16"/>
+              </w:rPr>
+              <w:t xml:space="preserve">125  </w:t>
+            </w:r>
+          </w:p>
+          <w:p>
+            <w:pPr>
+              <w:spacing w:after="0" w:line="240" w:lineRule="auto"/>
+            </w:pPr>
+            <w:r>
+              <w:rPr>
+                <w:rFonts w:ascii="Courier New" w:hAnsi="Courier New"/>
+                <w:sz w:val="16"/>
+              </w:rPr>
+              <w:t>126      def _plain_text(self, status: int, reason: str, message: str) -&gt; Response:</w:t>
+            </w:r>
+          </w:p>
+          <w:p>
+            <w:pPr>
+              <w:spacing w:after="0" w:line="240" w:lineRule="auto"/>
+            </w:pPr>
+            <w:r>
+              <w:rPr>
+                <w:rFonts w:ascii="Courier New" w:hAnsi="Courier New"/>
+                <w:sz w:val="16"/>
+              </w:rPr>
+              <w:t>127          return Response(</w:t>
+            </w:r>
+          </w:p>
+          <w:p>
+            <w:pPr>
+              <w:spacing w:after="0" w:line="240" w:lineRule="auto"/>
+            </w:pPr>
+            <w:r>
+              <w:rPr>
+                <w:rFonts w:ascii="Courier New" w:hAnsi="Courier New"/>
+                <w:sz w:val="16"/>
+              </w:rPr>
+              <w:t>128              status=status,</w:t>
+            </w:r>
+          </w:p>
+          <w:p>
+            <w:pPr>
+              <w:spacing w:after="0" w:line="240" w:lineRule="auto"/>
+            </w:pPr>
+            <w:r>
+              <w:rPr>
+                <w:rFonts w:ascii="Courier New" w:hAnsi="Courier New"/>
+                <w:sz w:val="16"/>
+              </w:rPr>
+              <w:t>129              reason=reason,</w:t>
+            </w:r>
+          </w:p>
+          <w:p>
+            <w:pPr>
+              <w:spacing w:after="0" w:line="240" w:lineRule="auto"/>
+            </w:pPr>
+            <w:r>
+              <w:rPr>
+                <w:rFonts w:ascii="Courier New" w:hAnsi="Courier New"/>
+                <w:sz w:val="16"/>
+              </w:rPr>
+              <w:t>130              body=message.encode("utf-8"),</w:t>
+            </w:r>
+          </w:p>
+          <w:p>
+            <w:pPr>
+              <w:spacing w:after="0" w:line="240" w:lineRule="auto"/>
+            </w:pPr>
+            <w:r>
+              <w:rPr>
+                <w:rFonts w:ascii="Courier New" w:hAnsi="Courier New"/>
+                <w:sz w:val="16"/>
+              </w:rPr>
+              <w:t>131              content_type="text/plain; charset=utf-8",</w:t>
+            </w:r>
+          </w:p>
+          <w:p>
+            <w:pPr>
+              <w:spacing w:after="0" w:line="240" w:lineRule="auto"/>
+            </w:pPr>
+            <w:r>
+              <w:rPr>
+                <w:rFonts w:ascii="Courier New" w:hAnsi="Courier New"/>
+                <w:sz w:val="16"/>
+              </w:rPr>
+              <w:t>132          )</w:t>
+            </w:r>
+          </w:p>
+          <w:p>
+            <w:pPr>
+              <w:spacing w:after="0" w:line="240" w:lineRule="auto"/>
+            </w:pPr>
+            <w:r>
+              <w:rPr>
+                <w:rFonts w:ascii="Courier New" w:hAnsi="Courier New"/>
+                <w:sz w:val="16"/>
+              </w:rPr>
+              <w:t xml:space="preserve">133  </w:t>
+            </w:r>
+          </w:p>
+          <w:p>
+            <w:pPr>
+              <w:spacing w:after="0" w:line="240" w:lineRule="auto"/>
+            </w:pPr>
+            <w:r>
+              <w:rPr>
+                <w:rFonts w:ascii="Courier New" w:hAnsi="Courier New"/>
+                <w:sz w:val="16"/>
+              </w:rPr>
+              <w:t>134      def _build_response(self, response: Response) -&gt; bytes:</w:t>
+            </w:r>
+          </w:p>
+          <w:p>
+            <w:pPr>
+              <w:spacing w:after="0" w:line="240" w:lineRule="auto"/>
+            </w:pPr>
+            <w:r>
+              <w:rPr>
+                <w:rFonts w:ascii="Courier New" w:hAnsi="Courier New"/>
+                <w:sz w:val="16"/>
+              </w:rPr>
+              <w:t>135          headers = [</w:t>
+            </w:r>
+          </w:p>
+          <w:p>
+            <w:pPr>
+              <w:spacing w:after="0" w:line="240" w:lineRule="auto"/>
+            </w:pPr>
+            <w:r>
+              <w:rPr>
+                <w:rFonts w:ascii="Courier New" w:hAnsi="Courier New"/>
+                <w:sz w:val="16"/>
+              </w:rPr>
+              <w:t>136              f"HTTP/1.1 {response.status} {response.reason}",</w:t>
+            </w:r>
+          </w:p>
+          <w:p>
+            <w:pPr>
+              <w:spacing w:after="0" w:line="240" w:lineRule="auto"/>
+            </w:pPr>
+            <w:r>
+              <w:rPr>
+                <w:rFonts w:ascii="Courier New" w:hAnsi="Courier New"/>
+                <w:sz w:val="16"/>
+              </w:rPr>
+              <w:t>137              f"Content-Type: {response.content_type}",</w:t>
+            </w:r>
+          </w:p>
+          <w:p>
+            <w:pPr>
+              <w:spacing w:after="0" w:line="240" w:lineRule="auto"/>
+            </w:pPr>
+            <w:r>
+              <w:rPr>
+                <w:rFonts w:ascii="Courier New" w:hAnsi="Courier New"/>
+                <w:sz w:val="16"/>
+              </w:rPr>
+              <w:t>138              f"Content-Length: {len(response.body)}",</w:t>
+            </w:r>
+          </w:p>
+          <w:p>
+            <w:pPr>
+              <w:spacing w:after="0" w:line="240" w:lineRule="auto"/>
+            </w:pPr>
+            <w:r>
+              <w:rPr>
+                <w:rFonts w:ascii="Courier New" w:hAnsi="Courier New"/>
+                <w:sz w:val="16"/>
+              </w:rPr>
+              <w:t>139              "Connection: close",</w:t>
+            </w:r>
+          </w:p>
+          <w:p>
+            <w:pPr>
+              <w:spacing w:after="0" w:line="240" w:lineRule="auto"/>
+            </w:pPr>
+            <w:r>
+              <w:rPr>
+                <w:rFonts w:ascii="Courier New" w:hAnsi="Courier New"/>
+                <w:sz w:val="16"/>
+              </w:rPr>
+              <w:t>140              "",</w:t>
+            </w:r>
+          </w:p>
+          <w:p>
+            <w:pPr>
+              <w:spacing w:after="0" w:line="240" w:lineRule="auto"/>
+            </w:pPr>
+            <w:r>
+              <w:rPr>
+                <w:rFonts w:ascii="Courier New" w:hAnsi="Courier New"/>
+                <w:sz w:val="16"/>
+              </w:rPr>
+              <w:t>141              "",</w:t>
+            </w:r>
+          </w:p>
+          <w:p>
+            <w:pPr>
+              <w:spacing w:after="0" w:line="240" w:lineRule="auto"/>
+            </w:pPr>
+            <w:r>
+              <w:rPr>
+                <w:rFonts w:ascii="Courier New" w:hAnsi="Courier New"/>
+                <w:sz w:val="16"/>
+              </w:rPr>
+              <w:t>142          ]</w:t>
+            </w:r>
+          </w:p>
+          <w:p>
+            <w:pPr>
+              <w:spacing w:after="0" w:line="240" w:lineRule="auto"/>
+            </w:pPr>
+            <w:r>
+              <w:rPr>
+                <w:rFonts w:ascii="Courier New" w:hAnsi="Courier New"/>
+                <w:sz w:val="16"/>
+              </w:rPr>
+              <w:t>143          return CRLF.join(headers).encode("utf-8") + response.body</w:t>
+            </w:r>
+          </w:p>
+          <w:p>
+            <w:pPr>
+              <w:spacing w:after="0" w:line="240" w:lineRule="auto"/>
+            </w:pPr>
+            <w:r>
+              <w:rPr>
+                <w:rFonts w:ascii="Courier New" w:hAnsi="Courier New"/>
+                <w:sz w:val="16"/>
+              </w:rPr>
+              <w:t xml:space="preserve">144  </w:t>
+            </w:r>
+          </w:p>
+          <w:p>
+            <w:pPr>
+              <w:spacing w:after="0" w:line="240" w:lineRule="auto"/>
+            </w:pPr>
+            <w:r>
+              <w:rPr>
+                <w:rFonts w:ascii="Courier New" w:hAnsi="Courier New"/>
+                <w:sz w:val="16"/>
+              </w:rPr>
+              <w:t>145      def _log(self, client_ip: str, method: str, path: str, status: int) -&gt; None:</w:t>
+            </w:r>
+          </w:p>
+          <w:p>
+            <w:pPr>
+              <w:spacing w:after="0" w:line="240" w:lineRule="auto"/>
+            </w:pPr>
+            <w:r>
+              <w:rPr>
+                <w:rFonts w:ascii="Courier New" w:hAnsi="Courier New"/>
+                <w:sz w:val="16"/>
+              </w:rPr>
+              <w:t>146          now = datetime.now().strftime("%Y-%m-%d %H:%M:%S")</w:t>
+            </w:r>
+          </w:p>
+          <w:p>
+            <w:pPr>
+              <w:spacing w:after="0" w:line="240" w:lineRule="auto"/>
+            </w:pPr>
+            <w:r>
+              <w:rPr>
+                <w:rFonts w:ascii="Courier New" w:hAnsi="Courier New"/>
+                <w:sz w:val="16"/>
+              </w:rPr>
+              <w:t>147          print(f"{now} {client_ip} {method} {path} {status}")</w:t>
+            </w:r>
+          </w:p>
+        </w:tc>
+      </w:tr>
+    </w:tbl>
+    <w:p>
+      <w:pPr>
+        <w:pStyle w:val="2"/>
+      </w:pPr>
+      <w:r/>
+      <w:r>
+        <w:rPr>
+          <w:rFonts w:ascii="Times New Roman" w:hAnsi="Times New Roman"/>
+          <w:b/>
+          <w:color w:val="1F4E79"/>
+          <w:sz w:val="26"/>
+        </w:rPr>
+        <w:t>Приложение Г. Листинг файла public/index.html</w:t>
+      </w:r>
+    </w:p>
+    <w:p>
+      <w:pPr>
+        <w:spacing w:after="80"/>
+      </w:pPr>
+      <w:r>
+        <w:rPr>
+          <w:rFonts w:ascii="Times New Roman" w:hAnsi="Times New Roman"/>
+          <w:i/>
+          <w:sz w:val="24"/>
+        </w:rPr>
+        <w:t>Файл: src/public/index.html</w:t>
+      </w:r>
+    </w:p>
+    <w:tbl>
+      <w:tblPr>
+        <w:tblW w:type="auto" w:w="0"/>
+        <w:jc w:val="center"/>
+        <w:tblLook w:firstColumn="1" w:firstRow="1" w:lastColumn="0" w:lastRow="0" w:noHBand="0" w:noVBand="1" w:val="04A0"/>
+        <w:tblBorders>
+          <w:top w:val="single" w:sz="4" w:space="0" w:color="D5DEE8"/>
+          <w:left w:val="single" w:sz="4" w:space="0" w:color="D5DEE8"/>
+          <w:bottom w:val="single" w:sz="4" w:space="0" w:color="D5DEE8"/>
+          <w:right w:val="single" w:sz="4" w:space="0" w:color="D5DEE8"/>
+          <w:insideH w:val="single" w:sz="4" w:space="0" w:color="D5DEE8"/>
+          <w:insideV w:val="single" w:sz="4" w:space="0" w:color="D5DEE8"/>
+        </w:tblBorders>
+      </w:tblPr>
+      <w:tblGrid>
+        <w:gridCol w:w="9355"/>
+      </w:tblGrid>
+      <w:tr>
+        <w:tc>
+          <w:tcPr>
+            <w:tcW w:type="dxa" w:w="9355"/>
+            <w:shd w:fill="F7F9FC"/>
+          </w:tcPr>
+          <w:p>
+            <w:r/>
+          </w:p>
+          <w:p>
+            <w:pPr>
+              <w:spacing w:after="0" w:line="240" w:lineRule="auto"/>
+            </w:pPr>
+            <w:r>
+              <w:rPr>
+                <w:rFonts w:ascii="Courier New" w:hAnsi="Courier New"/>
+                <w:sz w:val="16"/>
+              </w:rPr>
+              <w:t>001  &lt;!doctype html&gt;</w:t>
+            </w:r>
+          </w:p>
+          <w:p>
+            <w:pPr>
+              <w:spacing w:after="0" w:line="240" w:lineRule="auto"/>
+            </w:pPr>
+            <w:r>
+              <w:rPr>
+                <w:rFonts w:ascii="Courier New" w:hAnsi="Courier New"/>
+                <w:sz w:val="16"/>
+              </w:rPr>
+              <w:t>002  &lt;html lang="ru"&gt;</w:t>
+            </w:r>
+          </w:p>
+          <w:p>
+            <w:pPr>
+              <w:spacing w:after="0" w:line="240" w:lineRule="auto"/>
+            </w:pPr>
+            <w:r>
+              <w:rPr>
+                <w:rFonts w:ascii="Courier New" w:hAnsi="Courier New"/>
+                <w:sz w:val="16"/>
+              </w:rPr>
+              <w:t>003    &lt;head&gt;</w:t>
+            </w:r>
+          </w:p>
+          <w:p>
+            <w:pPr>
+              <w:spacing w:after="0" w:line="240" w:lineRule="auto"/>
+            </w:pPr>
+            <w:r>
+              <w:rPr>
+                <w:rFonts w:ascii="Courier New" w:hAnsi="Courier New"/>
+                <w:sz w:val="16"/>
+              </w:rPr>
+              <w:t>004      &lt;meta charset="utf-8"&gt;</w:t>
+            </w:r>
+          </w:p>
+          <w:p>
+            <w:pPr>
+              <w:spacing w:after="0" w:line="240" w:lineRule="auto"/>
+            </w:pPr>
+            <w:r>
+              <w:rPr>
+                <w:rFonts w:ascii="Courier New" w:hAnsi="Courier New"/>
+                <w:sz w:val="16"/>
+              </w:rPr>
+              <w:t>005      &lt;title&gt;Простой HTTP-сервер&lt;/title&gt;</w:t>
+            </w:r>
+          </w:p>
+          <w:p>
+            <w:pPr>
+              <w:spacing w:after="0" w:line="240" w:lineRule="auto"/>
+            </w:pPr>
+            <w:r>
+              <w:rPr>
+                <w:rFonts w:ascii="Courier New" w:hAnsi="Courier New"/>
+                <w:sz w:val="16"/>
+              </w:rPr>
+              <w:t>006      &lt;link rel="stylesheet" href="/static/style.css"&gt;</w:t>
+            </w:r>
+          </w:p>
+          <w:p>
+            <w:pPr>
+              <w:spacing w:after="0" w:line="240" w:lineRule="auto"/>
+            </w:pPr>
+            <w:r>
+              <w:rPr>
+                <w:rFonts w:ascii="Courier New" w:hAnsi="Courier New"/>
+                <w:sz w:val="16"/>
+              </w:rPr>
+              <w:t>007    &lt;/head&gt;</w:t>
+            </w:r>
+          </w:p>
+          <w:p>
+            <w:pPr>
+              <w:spacing w:after="0" w:line="240" w:lineRule="auto"/>
+            </w:pPr>
+            <w:r>
+              <w:rPr>
+                <w:rFonts w:ascii="Courier New" w:hAnsi="Courier New"/>
+                <w:sz w:val="16"/>
+              </w:rPr>
+              <w:t>008    &lt;body&gt;</w:t>
+            </w:r>
+          </w:p>
+          <w:p>
+            <w:pPr>
+              <w:spacing w:after="0" w:line="240" w:lineRule="auto"/>
+            </w:pPr>
+            <w:r>
+              <w:rPr>
+                <w:rFonts w:ascii="Courier New" w:hAnsi="Courier New"/>
+                <w:sz w:val="16"/>
+              </w:rPr>
+              <w:t>009      &lt;main class="page"&gt;</w:t>
+            </w:r>
+          </w:p>
+          <w:p>
+            <w:pPr>
+              <w:spacing w:after="0" w:line="240" w:lineRule="auto"/>
+            </w:pPr>
+            <w:r>
+              <w:rPr>
+                <w:rFonts w:ascii="Courier New" w:hAnsi="Courier New"/>
+                <w:sz w:val="16"/>
+              </w:rPr>
+              <w:t>010        &lt;p class="eyebrow"&gt;Вариативная часть практики&lt;/p&gt;</w:t>
+            </w:r>
+          </w:p>
+          <w:p>
+            <w:pPr>
+              <w:spacing w:after="0" w:line="240" w:lineRule="auto"/>
+            </w:pPr>
+            <w:r>
+              <w:rPr>
+                <w:rFonts w:ascii="Courier New" w:hAnsi="Courier New"/>
+                <w:sz w:val="16"/>
+              </w:rPr>
+              <w:t>011        &lt;h1&gt;Простой HTTP-сервер на Python&lt;/h1&gt;</w:t>
+            </w:r>
+          </w:p>
+          <w:p>
+            <w:pPr>
+              <w:spacing w:after="0" w:line="240" w:lineRule="auto"/>
+            </w:pPr>
+            <w:r>
+              <w:rPr>
+                <w:rFonts w:ascii="Courier New" w:hAnsi="Courier New"/>
+                <w:sz w:val="16"/>
+              </w:rPr>
+              <w:t>012        &lt;p&gt;</w:t>
+            </w:r>
+          </w:p>
+          <w:p>
+            <w:pPr>
+              <w:spacing w:after="0" w:line="240" w:lineRule="auto"/>
+            </w:pPr>
+            <w:r>
+              <w:rPr>
+                <w:rFonts w:ascii="Courier New" w:hAnsi="Courier New"/>
+                <w:sz w:val="16"/>
+              </w:rPr>
+              <w:t>013          Это учебный сервер, написанный без веб-фреймворков. Он показывает,</w:t>
+            </w:r>
+          </w:p>
+          <w:p>
+            <w:pPr>
+              <w:spacing w:after="0" w:line="240" w:lineRule="auto"/>
+            </w:pPr>
+            <w:r>
+              <w:rPr>
+                <w:rFonts w:ascii="Courier New" w:hAnsi="Courier New"/>
+                <w:sz w:val="16"/>
+              </w:rPr>
+              <w:t>014          как Python принимает HTTP-запрос, выбирает маршрут и формирует ответ.</w:t>
+            </w:r>
+          </w:p>
+          <w:p>
+            <w:pPr>
+              <w:spacing w:after="0" w:line="240" w:lineRule="auto"/>
+            </w:pPr>
+            <w:r>
+              <w:rPr>
+                <w:rFonts w:ascii="Courier New" w:hAnsi="Courier New"/>
+                <w:sz w:val="16"/>
+              </w:rPr>
+              <w:t>015        &lt;/p&gt;</w:t>
+            </w:r>
+          </w:p>
+          <w:p>
+            <w:pPr>
+              <w:spacing w:after="0" w:line="240" w:lineRule="auto"/>
+            </w:pPr>
+            <w:r>
+              <w:rPr>
+                <w:rFonts w:ascii="Courier New" w:hAnsi="Courier New"/>
+                <w:sz w:val="16"/>
+              </w:rPr>
+              <w:t>016        &lt;nav&gt;</w:t>
+            </w:r>
+          </w:p>
+          <w:p>
+            <w:pPr>
+              <w:spacing w:after="0" w:line="240" w:lineRule="auto"/>
+            </w:pPr>
+            <w:r>
+              <w:rPr>
+                <w:rFonts w:ascii="Courier New" w:hAnsi="Courier New"/>
+                <w:sz w:val="16"/>
+              </w:rPr>
+              <w:t>017          &lt;a href="/"&gt;Главная&lt;/a&gt;</w:t>
+            </w:r>
+          </w:p>
+          <w:p>
+            <w:pPr>
+              <w:spacing w:after="0" w:line="240" w:lineRule="auto"/>
+            </w:pPr>
+            <w:r>
+              <w:rPr>
+                <w:rFonts w:ascii="Courier New" w:hAnsi="Courier New"/>
+                <w:sz w:val="16"/>
+              </w:rPr>
+              <w:t>018          &lt;a href="/about"&gt;О проекте&lt;/a&gt;</w:t>
+            </w:r>
+          </w:p>
+          <w:p>
+            <w:pPr>
+              <w:spacing w:after="0" w:line="240" w:lineRule="auto"/>
+            </w:pPr>
+            <w:r>
+              <w:rPr>
+                <w:rFonts w:ascii="Courier New" w:hAnsi="Courier New"/>
+                <w:sz w:val="16"/>
+              </w:rPr>
+              <w:t>019          &lt;a href="/missing"&gt;Проверка 404&lt;/a&gt;</w:t>
+            </w:r>
+          </w:p>
+          <w:p>
+            <w:pPr>
+              <w:spacing w:after="0" w:line="240" w:lineRule="auto"/>
+            </w:pPr>
+            <w:r>
+              <w:rPr>
+                <w:rFonts w:ascii="Courier New" w:hAnsi="Courier New"/>
+                <w:sz w:val="16"/>
+              </w:rPr>
+              <w:t>020        &lt;/nav&gt;</w:t>
+            </w:r>
+          </w:p>
+          <w:p>
+            <w:pPr>
+              <w:spacing w:after="0" w:line="240" w:lineRule="auto"/>
+            </w:pPr>
+            <w:r>
+              <w:rPr>
+                <w:rFonts w:ascii="Courier New" w:hAnsi="Courier New"/>
+                <w:sz w:val="16"/>
+              </w:rPr>
+              <w:t>021      &lt;/main&gt;</w:t>
+            </w:r>
+          </w:p>
+          <w:p>
+            <w:pPr>
+              <w:spacing w:after="0" w:line="240" w:lineRule="auto"/>
+            </w:pPr>
+            <w:r>
+              <w:rPr>
+                <w:rFonts w:ascii="Courier New" w:hAnsi="Courier New"/>
+                <w:sz w:val="16"/>
+              </w:rPr>
+              <w:t>022    &lt;/body&gt;</w:t>
+            </w:r>
+          </w:p>
+          <w:p>
+            <w:pPr>
+              <w:spacing w:after="0" w:line="240" w:lineRule="auto"/>
+            </w:pPr>
+            <w:r>
+              <w:rPr>
+                <w:rFonts w:ascii="Courier New" w:hAnsi="Courier New"/>
+                <w:sz w:val="16"/>
+              </w:rPr>
+              <w:t>023  &lt;/html&gt;</w:t>
+            </w:r>
+          </w:p>
+        </w:tc>
+      </w:tr>
+    </w:tbl>
+    <w:p>
+      <w:pPr>
+        <w:pStyle w:val="2"/>
+      </w:pPr>
+      <w:r/>
+      <w:r>
+        <w:rPr>
+          <w:rFonts w:ascii="Times New Roman" w:hAnsi="Times New Roman"/>
+          <w:b/>
+          <w:color w:val="1F4E79"/>
+          <w:sz w:val="26"/>
+        </w:rPr>
+        <w:t>Приложение Д. Листинг файла public/about.html</w:t>
+      </w:r>
+    </w:p>
+    <w:p>
+      <w:pPr>
+        <w:spacing w:after="80"/>
+      </w:pPr>
+      <w:r>
+        <w:rPr>
+          <w:rFonts w:ascii="Times New Roman" w:hAnsi="Times New Roman"/>
+          <w:i/>
+          <w:sz w:val="24"/>
+        </w:rPr>
+        <w:t>Файл: src/public/about.html</w:t>
+      </w:r>
+    </w:p>
+    <w:tbl>
+      <w:tblPr>
+        <w:tblW w:type="auto" w:w="0"/>
+        <w:jc w:val="center"/>
+        <w:tblLook w:firstColumn="1" w:firstRow="1" w:lastColumn="0" w:lastRow="0" w:noHBand="0" w:noVBand="1" w:val="04A0"/>
+        <w:tblBorders>
+          <w:top w:val="single" w:sz="4" w:space="0" w:color="D5DEE8"/>
+          <w:left w:val="single" w:sz="4" w:space="0" w:color="D5DEE8"/>
+          <w:bottom w:val="single" w:sz="4" w:space="0" w:color="D5DEE8"/>
+          <w:right w:val="single" w:sz="4" w:space="0" w:color="D5DEE8"/>
+          <w:insideH w:val="single" w:sz="4" w:space="0" w:color="D5DEE8"/>
+          <w:insideV w:val="single" w:sz="4" w:space="0" w:color="D5DEE8"/>
+        </w:tblBorders>
+      </w:tblPr>
+      <w:tblGrid>
+        <w:gridCol w:w="9355"/>
+      </w:tblGrid>
+      <w:tr>
+        <w:tc>
+          <w:tcPr>
+            <w:tcW w:type="dxa" w:w="9355"/>
+            <w:shd w:fill="F7F9FC"/>
+          </w:tcPr>
+          <w:p>
+            <w:r/>
+          </w:p>
+          <w:p>
+            <w:pPr>
+              <w:spacing w:after="0" w:line="240" w:lineRule="auto"/>
+            </w:pPr>
+            <w:r>
+              <w:rPr>
+                <w:rFonts w:ascii="Courier New" w:hAnsi="Courier New"/>
+                <w:sz w:val="16"/>
+              </w:rPr>
+              <w:t>001  &lt;!doctype html&gt;</w:t>
+            </w:r>
+          </w:p>
+          <w:p>
+            <w:pPr>
+              <w:spacing w:after="0" w:line="240" w:lineRule="auto"/>
+            </w:pPr>
+            <w:r>
+              <w:rPr>
+                <w:rFonts w:ascii="Courier New" w:hAnsi="Courier New"/>
+                <w:sz w:val="16"/>
+              </w:rPr>
+              <w:t>002  &lt;html lang="ru"&gt;</w:t>
+            </w:r>
+          </w:p>
+          <w:p>
+            <w:pPr>
+              <w:spacing w:after="0" w:line="240" w:lineRule="auto"/>
+            </w:pPr>
+            <w:r>
+              <w:rPr>
+                <w:rFonts w:ascii="Courier New" w:hAnsi="Courier New"/>
+                <w:sz w:val="16"/>
+              </w:rPr>
+              <w:t>003    &lt;head&gt;</w:t>
+            </w:r>
+          </w:p>
+          <w:p>
+            <w:pPr>
+              <w:spacing w:after="0" w:line="240" w:lineRule="auto"/>
+            </w:pPr>
+            <w:r>
+              <w:rPr>
+                <w:rFonts w:ascii="Courier New" w:hAnsi="Courier New"/>
+                <w:sz w:val="16"/>
+              </w:rPr>
+              <w:t>004      &lt;meta charset="utf-8"&gt;</w:t>
+            </w:r>
+          </w:p>
+          <w:p>
+            <w:pPr>
+              <w:spacing w:after="0" w:line="240" w:lineRule="auto"/>
+            </w:pPr>
+            <w:r>
+              <w:rPr>
+                <w:rFonts w:ascii="Courier New" w:hAnsi="Courier New"/>
+                <w:sz w:val="16"/>
+              </w:rPr>
+              <w:t>005      &lt;title&gt;О проекте&lt;/title&gt;</w:t>
+            </w:r>
+          </w:p>
+          <w:p>
+            <w:pPr>
+              <w:spacing w:after="0" w:line="240" w:lineRule="auto"/>
+            </w:pPr>
+            <w:r>
+              <w:rPr>
+                <w:rFonts w:ascii="Courier New" w:hAnsi="Courier New"/>
+                <w:sz w:val="16"/>
+              </w:rPr>
+              <w:t>006      &lt;link rel="stylesheet" href="/static/style.css"&gt;</w:t>
+            </w:r>
+          </w:p>
+          <w:p>
+            <w:pPr>
+              <w:spacing w:after="0" w:line="240" w:lineRule="auto"/>
+            </w:pPr>
+            <w:r>
+              <w:rPr>
+                <w:rFonts w:ascii="Courier New" w:hAnsi="Courier New"/>
+                <w:sz w:val="16"/>
+              </w:rPr>
+              <w:t>007    &lt;/head&gt;</w:t>
+            </w:r>
+          </w:p>
+          <w:p>
+            <w:pPr>
+              <w:spacing w:after="0" w:line="240" w:lineRule="auto"/>
+            </w:pPr>
+            <w:r>
+              <w:rPr>
+                <w:rFonts w:ascii="Courier New" w:hAnsi="Courier New"/>
+                <w:sz w:val="16"/>
+              </w:rPr>
+              <w:t>008    &lt;body&gt;</w:t>
+            </w:r>
+          </w:p>
+          <w:p>
+            <w:pPr>
+              <w:spacing w:after="0" w:line="240" w:lineRule="auto"/>
+            </w:pPr>
+            <w:r>
+              <w:rPr>
+                <w:rFonts w:ascii="Courier New" w:hAnsi="Courier New"/>
+                <w:sz w:val="16"/>
+              </w:rPr>
+              <w:t>009      &lt;main class="page"&gt;</w:t>
+            </w:r>
+          </w:p>
+          <w:p>
+            <w:pPr>
+              <w:spacing w:after="0" w:line="240" w:lineRule="auto"/>
+            </w:pPr>
+            <w:r>
+              <w:rPr>
+                <w:rFonts w:ascii="Courier New" w:hAnsi="Courier New"/>
+                <w:sz w:val="16"/>
+              </w:rPr>
+              <w:t>010        &lt;p class="eyebrow"&gt;О проекте&lt;/p&gt;</w:t>
+            </w:r>
+          </w:p>
+          <w:p>
+            <w:pPr>
+              <w:spacing w:after="0" w:line="240" w:lineRule="auto"/>
+            </w:pPr>
+            <w:r>
+              <w:rPr>
+                <w:rFonts w:ascii="Courier New" w:hAnsi="Courier New"/>
+                <w:sz w:val="16"/>
+              </w:rPr>
+              <w:t>011        &lt;h1&gt;Как работает сервер&lt;/h1&gt;</w:t>
+            </w:r>
+          </w:p>
+          <w:p>
+            <w:pPr>
+              <w:spacing w:after="0" w:line="240" w:lineRule="auto"/>
+            </w:pPr>
+            <w:r>
+              <w:rPr>
+                <w:rFonts w:ascii="Courier New" w:hAnsi="Courier New"/>
+                <w:sz w:val="16"/>
+              </w:rPr>
+              <w:t>012        &lt;p&gt;</w:t>
+            </w:r>
+          </w:p>
+          <w:p>
+            <w:pPr>
+              <w:spacing w:after="0" w:line="240" w:lineRule="auto"/>
+            </w:pPr>
+            <w:r>
+              <w:rPr>
+                <w:rFonts w:ascii="Courier New" w:hAnsi="Courier New"/>
+                <w:sz w:val="16"/>
+              </w:rPr>
+              <w:t>013          Сервер открывает TCP-сокет, ожидает подключение клиента, читает первую</w:t>
+            </w:r>
+          </w:p>
+          <w:p>
+            <w:pPr>
+              <w:spacing w:after="0" w:line="240" w:lineRule="auto"/>
+            </w:pPr>
+            <w:r>
+              <w:rPr>
+                <w:rFonts w:ascii="Courier New" w:hAnsi="Courier New"/>
+                <w:sz w:val="16"/>
+              </w:rPr>
+              <w:t>014          строку HTTP-запроса и выбирает обработчик по пути запроса.</w:t>
+            </w:r>
+          </w:p>
+          <w:p>
+            <w:pPr>
+              <w:spacing w:after="0" w:line="240" w:lineRule="auto"/>
+            </w:pPr>
+            <w:r>
+              <w:rPr>
+                <w:rFonts w:ascii="Courier New" w:hAnsi="Courier New"/>
+                <w:sz w:val="16"/>
+              </w:rPr>
+              <w:t>015        &lt;/p&gt;</w:t>
+            </w:r>
+          </w:p>
+          <w:p>
+            <w:pPr>
+              <w:spacing w:after="0" w:line="240" w:lineRule="auto"/>
+            </w:pPr>
+            <w:r>
+              <w:rPr>
+                <w:rFonts w:ascii="Courier New" w:hAnsi="Courier New"/>
+                <w:sz w:val="16"/>
+              </w:rPr>
+              <w:t>016        &lt;ul&gt;</w:t>
+            </w:r>
+          </w:p>
+          <w:p>
+            <w:pPr>
+              <w:spacing w:after="0" w:line="240" w:lineRule="auto"/>
+            </w:pPr>
+            <w:r>
+              <w:rPr>
+                <w:rFonts w:ascii="Courier New" w:hAnsi="Courier New"/>
+                <w:sz w:val="16"/>
+              </w:rPr>
+              <w:t>017          &lt;li&gt;&lt;code&gt;GET /&lt;/code&gt; возвращает главную страницу.&lt;/li&gt;</w:t>
+            </w:r>
+          </w:p>
+          <w:p>
+            <w:pPr>
+              <w:spacing w:after="0" w:line="240" w:lineRule="auto"/>
+            </w:pPr>
+            <w:r>
+              <w:rPr>
+                <w:rFonts w:ascii="Courier New" w:hAnsi="Courier New"/>
+                <w:sz w:val="16"/>
+              </w:rPr>
+              <w:t>018          &lt;li&gt;&lt;code&gt;GET /about&lt;/code&gt; возвращает описание проекта.&lt;/li&gt;</w:t>
+            </w:r>
+          </w:p>
+          <w:p>
+            <w:pPr>
+              <w:spacing w:after="0" w:line="240" w:lineRule="auto"/>
+            </w:pPr>
+            <w:r>
+              <w:rPr>
+                <w:rFonts w:ascii="Courier New" w:hAnsi="Courier New"/>
+                <w:sz w:val="16"/>
+              </w:rPr>
+              <w:t>019          &lt;li&gt;&lt;code&gt;GET /static/style.css&lt;/code&gt; возвращает CSS-файл.&lt;/li&gt;</w:t>
+            </w:r>
+          </w:p>
+          <w:p>
+            <w:pPr>
+              <w:spacing w:after="0" w:line="240" w:lineRule="auto"/>
+            </w:pPr>
+            <w:r>
+              <w:rPr>
+                <w:rFonts w:ascii="Courier New" w:hAnsi="Courier New"/>
+                <w:sz w:val="16"/>
+              </w:rPr>
+              <w:t>020          &lt;li&gt;Неизвестный адрес возвращает &lt;code&gt;404 Not Found&lt;/code&gt;.&lt;/li&gt;</w:t>
+            </w:r>
+          </w:p>
+          <w:p>
+            <w:pPr>
+              <w:spacing w:after="0" w:line="240" w:lineRule="auto"/>
+            </w:pPr>
+            <w:r>
+              <w:rPr>
+                <w:rFonts w:ascii="Courier New" w:hAnsi="Courier New"/>
+                <w:sz w:val="16"/>
+              </w:rPr>
+              <w:t>021        &lt;/ul&gt;</w:t>
+            </w:r>
+          </w:p>
+          <w:p>
+            <w:pPr>
+              <w:spacing w:after="0" w:line="240" w:lineRule="auto"/>
+            </w:pPr>
+            <w:r>
+              <w:rPr>
+                <w:rFonts w:ascii="Courier New" w:hAnsi="Courier New"/>
+                <w:sz w:val="16"/>
+              </w:rPr>
+              <w:t>022        &lt;nav&gt;</w:t>
+            </w:r>
+          </w:p>
+          <w:p>
+            <w:pPr>
+              <w:spacing w:after="0" w:line="240" w:lineRule="auto"/>
+            </w:pPr>
+            <w:r>
+              <w:rPr>
+                <w:rFonts w:ascii="Courier New" w:hAnsi="Courier New"/>
+                <w:sz w:val="16"/>
+              </w:rPr>
+              <w:t>023          &lt;a href="/"&gt;На главную&lt;/a&gt;</w:t>
+            </w:r>
+          </w:p>
+          <w:p>
+            <w:pPr>
+              <w:spacing w:after="0" w:line="240" w:lineRule="auto"/>
+            </w:pPr>
+            <w:r>
+              <w:rPr>
+                <w:rFonts w:ascii="Courier New" w:hAnsi="Courier New"/>
+                <w:sz w:val="16"/>
+              </w:rPr>
+              <w:t>024        &lt;/nav&gt;</w:t>
+            </w:r>
+          </w:p>
+          <w:p>
+            <w:pPr>
+              <w:spacing w:after="0" w:line="240" w:lineRule="auto"/>
+            </w:pPr>
+            <w:r>
+              <w:rPr>
+                <w:rFonts w:ascii="Courier New" w:hAnsi="Courier New"/>
+                <w:sz w:val="16"/>
+              </w:rPr>
+              <w:t>025      &lt;/main&gt;</w:t>
+            </w:r>
+          </w:p>
+          <w:p>
+            <w:pPr>
+              <w:spacing w:after="0" w:line="240" w:lineRule="auto"/>
+            </w:pPr>
+            <w:r>
+              <w:rPr>
+                <w:rFonts w:ascii="Courier New" w:hAnsi="Courier New"/>
+                <w:sz w:val="16"/>
+              </w:rPr>
+              <w:t>026    &lt;/body&gt;</w:t>
+            </w:r>
+          </w:p>
+          <w:p>
+            <w:pPr>
+              <w:spacing w:after="0" w:line="240" w:lineRule="auto"/>
+            </w:pPr>
+            <w:r>
+              <w:rPr>
+                <w:rFonts w:ascii="Courier New" w:hAnsi="Courier New"/>
+                <w:sz w:val="16"/>
+              </w:rPr>
+              <w:t>027  &lt;/html&gt;</w:t>
+            </w:r>
+          </w:p>
+        </w:tc>
+      </w:tr>
+    </w:tbl>
+    <w:p>
+      <w:pPr>
+        <w:pStyle w:val="2"/>
+      </w:pPr>
+      <w:r/>
+      <w:r>
+        <w:rPr>
+          <w:rFonts w:ascii="Times New Roman" w:hAnsi="Times New Roman"/>
+          <w:b/>
+          <w:color w:val="1F4E79"/>
+          <w:sz w:val="26"/>
+        </w:rPr>
+        <w:t>Приложение Е. Листинг файла public/404.html</w:t>
+      </w:r>
+    </w:p>
+    <w:p>
+      <w:pPr>
+        <w:spacing w:after="80"/>
+      </w:pPr>
+      <w:r>
+        <w:rPr>
+          <w:rFonts w:ascii="Times New Roman" w:hAnsi="Times New Roman"/>
+          <w:i/>
+          <w:sz w:val="24"/>
+        </w:rPr>
+        <w:t>Файл: src/public/404.html</w:t>
+      </w:r>
+    </w:p>
+    <w:tbl>
+      <w:tblPr>
+        <w:tblW w:type="auto" w:w="0"/>
+        <w:jc w:val="center"/>
+        <w:tblLook w:firstColumn="1" w:firstRow="1" w:lastColumn="0" w:lastRow="0" w:noHBand="0" w:noVBand="1" w:val="04A0"/>
+        <w:tblBorders>
+          <w:top w:val="single" w:sz="4" w:space="0" w:color="D5DEE8"/>
+          <w:left w:val="single" w:sz="4" w:space="0" w:color="D5DEE8"/>
+          <w:bottom w:val="single" w:sz="4" w:space="0" w:color="D5DEE8"/>
+          <w:right w:val="single" w:sz="4" w:space="0" w:color="D5DEE8"/>
+          <w:insideH w:val="single" w:sz="4" w:space="0" w:color="D5DEE8"/>
+          <w:insideV w:val="single" w:sz="4" w:space="0" w:color="D5DEE8"/>
+        </w:tblBorders>
+      </w:tblPr>
+      <w:tblGrid>
+        <w:gridCol w:w="9355"/>
+      </w:tblGrid>
+      <w:tr>
+        <w:tc>
+          <w:tcPr>
+            <w:tcW w:type="dxa" w:w="9355"/>
+            <w:shd w:fill="F7F9FC"/>
+          </w:tcPr>
+          <w:p>
+            <w:r/>
+          </w:p>
+          <w:p>
+            <w:pPr>
+              <w:spacing w:after="0" w:line="240" w:lineRule="auto"/>
+            </w:pPr>
+            <w:r>
+              <w:rPr>
+                <w:rFonts w:ascii="Courier New" w:hAnsi="Courier New"/>
+                <w:sz w:val="16"/>
+              </w:rPr>
+              <w:t>001  &lt;!doctype html&gt;</w:t>
+            </w:r>
+          </w:p>
+          <w:p>
+            <w:pPr>
+              <w:spacing w:after="0" w:line="240" w:lineRule="auto"/>
+            </w:pPr>
+            <w:r>
+              <w:rPr>
+                <w:rFonts w:ascii="Courier New" w:hAnsi="Courier New"/>
+                <w:sz w:val="16"/>
+              </w:rPr>
+              <w:t>002  &lt;html lang="ru"&gt;</w:t>
+            </w:r>
+          </w:p>
+          <w:p>
+            <w:pPr>
+              <w:spacing w:after="0" w:line="240" w:lineRule="auto"/>
+            </w:pPr>
+            <w:r>
+              <w:rPr>
+                <w:rFonts w:ascii="Courier New" w:hAnsi="Courier New"/>
+                <w:sz w:val="16"/>
+              </w:rPr>
+              <w:t>003    &lt;head&gt;</w:t>
+            </w:r>
+          </w:p>
+          <w:p>
+            <w:pPr>
+              <w:spacing w:after="0" w:line="240" w:lineRule="auto"/>
+            </w:pPr>
+            <w:r>
+              <w:rPr>
+                <w:rFonts w:ascii="Courier New" w:hAnsi="Courier New"/>
+                <w:sz w:val="16"/>
+              </w:rPr>
+              <w:t>004      &lt;meta charset="utf-8"&gt;</w:t>
+            </w:r>
+          </w:p>
+          <w:p>
+            <w:pPr>
+              <w:spacing w:after="0" w:line="240" w:lineRule="auto"/>
+            </w:pPr>
+            <w:r>
+              <w:rPr>
+                <w:rFonts w:ascii="Courier New" w:hAnsi="Courier New"/>
+                <w:sz w:val="16"/>
+              </w:rPr>
+              <w:t>005      &lt;title&gt;404 Not Found&lt;/title&gt;</w:t>
+            </w:r>
+          </w:p>
+          <w:p>
+            <w:pPr>
+              <w:spacing w:after="0" w:line="240" w:lineRule="auto"/>
+            </w:pPr>
+            <w:r>
+              <w:rPr>
+                <w:rFonts w:ascii="Courier New" w:hAnsi="Courier New"/>
+                <w:sz w:val="16"/>
+              </w:rPr>
+              <w:t>006      &lt;link rel="stylesheet" href="/static/style.css"&gt;</w:t>
+            </w:r>
+          </w:p>
+          <w:p>
+            <w:pPr>
+              <w:spacing w:after="0" w:line="240" w:lineRule="auto"/>
+            </w:pPr>
+            <w:r>
+              <w:rPr>
+                <w:rFonts w:ascii="Courier New" w:hAnsi="Courier New"/>
+                <w:sz w:val="16"/>
+              </w:rPr>
+              <w:t>007    &lt;/head&gt;</w:t>
+            </w:r>
+          </w:p>
+          <w:p>
+            <w:pPr>
+              <w:spacing w:after="0" w:line="240" w:lineRule="auto"/>
+            </w:pPr>
+            <w:r>
+              <w:rPr>
+                <w:rFonts w:ascii="Courier New" w:hAnsi="Courier New"/>
+                <w:sz w:val="16"/>
+              </w:rPr>
+              <w:t>008    &lt;body&gt;</w:t>
+            </w:r>
+          </w:p>
+          <w:p>
+            <w:pPr>
+              <w:spacing w:after="0" w:line="240" w:lineRule="auto"/>
+            </w:pPr>
+            <w:r>
+              <w:rPr>
+                <w:rFonts w:ascii="Courier New" w:hAnsi="Courier New"/>
+                <w:sz w:val="16"/>
+              </w:rPr>
+              <w:t>009      &lt;main class="page"&gt;</w:t>
+            </w:r>
+          </w:p>
+          <w:p>
+            <w:pPr>
+              <w:spacing w:after="0" w:line="240" w:lineRule="auto"/>
+            </w:pPr>
+            <w:r>
+              <w:rPr>
+                <w:rFonts w:ascii="Courier New" w:hAnsi="Courier New"/>
+                <w:sz w:val="16"/>
+              </w:rPr>
+              <w:t>010        &lt;p class="eyebrow"&gt;404&lt;/p&gt;</w:t>
+            </w:r>
+          </w:p>
+          <w:p>
+            <w:pPr>
+              <w:spacing w:after="0" w:line="240" w:lineRule="auto"/>
+            </w:pPr>
+            <w:r>
+              <w:rPr>
+                <w:rFonts w:ascii="Courier New" w:hAnsi="Courier New"/>
+                <w:sz w:val="16"/>
+              </w:rPr>
+              <w:t>011        &lt;h1&gt;Страница не найдена&lt;/h1&gt;</w:t>
+            </w:r>
+          </w:p>
+          <w:p>
+            <w:pPr>
+              <w:spacing w:after="0" w:line="240" w:lineRule="auto"/>
+            </w:pPr>
+            <w:r>
+              <w:rPr>
+                <w:rFonts w:ascii="Courier New" w:hAnsi="Courier New"/>
+                <w:sz w:val="16"/>
+              </w:rPr>
+              <w:t>012        &lt;p&gt;Сервер получил запрос, но не нашел подходящий маршрут или файл.&lt;/p&gt;</w:t>
+            </w:r>
+          </w:p>
+          <w:p>
+            <w:pPr>
+              <w:spacing w:after="0" w:line="240" w:lineRule="auto"/>
+            </w:pPr>
+            <w:r>
+              <w:rPr>
+                <w:rFonts w:ascii="Courier New" w:hAnsi="Courier New"/>
+                <w:sz w:val="16"/>
+              </w:rPr>
+              <w:t>013        &lt;nav&gt;</w:t>
+            </w:r>
+          </w:p>
+          <w:p>
+            <w:pPr>
+              <w:spacing w:after="0" w:line="240" w:lineRule="auto"/>
+            </w:pPr>
+            <w:r>
+              <w:rPr>
+                <w:rFonts w:ascii="Courier New" w:hAnsi="Courier New"/>
+                <w:sz w:val="16"/>
+              </w:rPr>
+              <w:t>014          &lt;a href="/"&gt;Вернуться на главную&lt;/a&gt;</w:t>
+            </w:r>
+          </w:p>
+          <w:p>
+            <w:pPr>
+              <w:spacing w:after="0" w:line="240" w:lineRule="auto"/>
+            </w:pPr>
+            <w:r>
+              <w:rPr>
+                <w:rFonts w:ascii="Courier New" w:hAnsi="Courier New"/>
+                <w:sz w:val="16"/>
+              </w:rPr>
+              <w:t>015        &lt;/nav&gt;</w:t>
+            </w:r>
+          </w:p>
+          <w:p>
+            <w:pPr>
+              <w:spacing w:after="0" w:line="240" w:lineRule="auto"/>
+            </w:pPr>
+            <w:r>
+              <w:rPr>
+                <w:rFonts w:ascii="Courier New" w:hAnsi="Courier New"/>
+                <w:sz w:val="16"/>
+              </w:rPr>
+              <w:t>016      &lt;/main&gt;</w:t>
+            </w:r>
+          </w:p>
+          <w:p>
+            <w:pPr>
+              <w:spacing w:after="0" w:line="240" w:lineRule="auto"/>
+            </w:pPr>
+            <w:r>
+              <w:rPr>
+                <w:rFonts w:ascii="Courier New" w:hAnsi="Courier New"/>
+                <w:sz w:val="16"/>
+              </w:rPr>
+              <w:t>017    &lt;/body&gt;</w:t>
+            </w:r>
+          </w:p>
+          <w:p>
+            <w:pPr>
+              <w:spacing w:after="0" w:line="240" w:lineRule="auto"/>
+            </w:pPr>
+            <w:r>
+              <w:rPr>
+                <w:rFonts w:ascii="Courier New" w:hAnsi="Courier New"/>
+                <w:sz w:val="16"/>
+              </w:rPr>
+              <w:t>018  &lt;/html&gt;</w:t>
+            </w:r>
+          </w:p>
+        </w:tc>
+      </w:tr>
+    </w:tbl>
+    <w:p>
+      <w:pPr>
+        <w:pStyle w:val="2"/>
+      </w:pPr>
+      <w:r/>
+      <w:r>
+        <w:rPr>
+          <w:rFonts w:ascii="Times New Roman" w:hAnsi="Times New Roman"/>
+          <w:b/>
+          <w:color w:val="1F4E79"/>
+          <w:sz w:val="26"/>
+        </w:rPr>
+        <w:t>Приложение Ж. Листинг файла public/style.css</w:t>
+      </w:r>
+    </w:p>
+    <w:p>
+      <w:pPr>
+        <w:spacing w:after="80"/>
+      </w:pPr>
+      <w:r>
+        <w:rPr>
+          <w:rFonts w:ascii="Times New Roman" w:hAnsi="Times New Roman"/>
+          <w:i/>
+          <w:sz w:val="24"/>
+        </w:rPr>
+        <w:t>Файл: src/public/style.css</w:t>
+      </w:r>
+    </w:p>
+    <w:tbl>
+      <w:tblPr>
+        <w:tblW w:type="auto" w:w="0"/>
+        <w:jc w:val="center"/>
+        <w:tblLook w:firstColumn="1" w:firstRow="1" w:lastColumn="0" w:lastRow="0" w:noHBand="0" w:noVBand="1" w:val="04A0"/>
+        <w:tblBorders>
+          <w:top w:val="single" w:sz="4" w:space="0" w:color="D5DEE8"/>
+          <w:left w:val="single" w:sz="4" w:space="0" w:color="D5DEE8"/>
+          <w:bottom w:val="single" w:sz="4" w:space="0" w:color="D5DEE8"/>
+          <w:right w:val="single" w:sz="4" w:space="0" w:color="D5DEE8"/>
+          <w:insideH w:val="single" w:sz="4" w:space="0" w:color="D5DEE8"/>
+          <w:insideV w:val="single" w:sz="4" w:space="0" w:color="D5DEE8"/>
+        </w:tblBorders>
+      </w:tblPr>
+      <w:tblGrid>
+        <w:gridCol w:w="9355"/>
+      </w:tblGrid>
+      <w:tr>
+        <w:tc>
+          <w:tcPr>
+            <w:tcW w:type="dxa" w:w="9355"/>
+            <w:shd w:fill="F7F9FC"/>
+          </w:tcPr>
+          <w:p>
+            <w:r/>
+          </w:p>
+          <w:p>
+            <w:pPr>
+              <w:spacing w:after="0" w:line="240" w:lineRule="auto"/>
+            </w:pPr>
+            <w:r>
+              <w:rPr>
+                <w:rFonts w:ascii="Courier New" w:hAnsi="Courier New"/>
+                <w:sz w:val="16"/>
+              </w:rPr>
+              <w:t>001  body {</w:t>
+            </w:r>
+          </w:p>
+          <w:p>
+            <w:pPr>
+              <w:spacing w:after="0" w:line="240" w:lineRule="auto"/>
+            </w:pPr>
+            <w:r>
+              <w:rPr>
+                <w:rFonts w:ascii="Courier New" w:hAnsi="Courier New"/>
+                <w:sz w:val="16"/>
+              </w:rPr>
+              <w:t>002    margin: 0;</w:t>
+            </w:r>
+          </w:p>
+          <w:p>
+            <w:pPr>
+              <w:spacing w:after="0" w:line="240" w:lineRule="auto"/>
+            </w:pPr>
+            <w:r>
+              <w:rPr>
+                <w:rFonts w:ascii="Courier New" w:hAnsi="Courier New"/>
+                <w:sz w:val="16"/>
+              </w:rPr>
+              <w:t>003    min-height: 100vh;</w:t>
+            </w:r>
+          </w:p>
+          <w:p>
+            <w:pPr>
+              <w:spacing w:after="0" w:line="240" w:lineRule="auto"/>
+            </w:pPr>
+            <w:r>
+              <w:rPr>
+                <w:rFonts w:ascii="Courier New" w:hAnsi="Courier New"/>
+                <w:sz w:val="16"/>
+              </w:rPr>
+              <w:t>004    display: grid;</w:t>
+            </w:r>
+          </w:p>
+          <w:p>
+            <w:pPr>
+              <w:spacing w:after="0" w:line="240" w:lineRule="auto"/>
+            </w:pPr>
+            <w:r>
+              <w:rPr>
+                <w:rFonts w:ascii="Courier New" w:hAnsi="Courier New"/>
+                <w:sz w:val="16"/>
+              </w:rPr>
+              <w:t>005    place-items: center;</w:t>
+            </w:r>
+          </w:p>
+          <w:p>
+            <w:pPr>
+              <w:spacing w:after="0" w:line="240" w:lineRule="auto"/>
+            </w:pPr>
+            <w:r>
+              <w:rPr>
+                <w:rFonts w:ascii="Courier New" w:hAnsi="Courier New"/>
+                <w:sz w:val="16"/>
+              </w:rPr>
+              <w:t>006    font-family: Arial, Helvetica, sans-serif;</w:t>
+            </w:r>
+          </w:p>
+          <w:p>
+            <w:pPr>
+              <w:spacing w:after="0" w:line="240" w:lineRule="auto"/>
+            </w:pPr>
+            <w:r>
+              <w:rPr>
+                <w:rFonts w:ascii="Courier New" w:hAnsi="Courier New"/>
+                <w:sz w:val="16"/>
+              </w:rPr>
+              <w:t>007    color: #111827;</w:t>
+            </w:r>
+          </w:p>
+          <w:p>
+            <w:pPr>
+              <w:spacing w:after="0" w:line="240" w:lineRule="auto"/>
+            </w:pPr>
+            <w:r>
+              <w:rPr>
+                <w:rFonts w:ascii="Courier New" w:hAnsi="Courier New"/>
+                <w:sz w:val="16"/>
+              </w:rPr>
+              <w:t>008    background: linear-gradient(135deg, #edf5ff, #f8fbff);</w:t>
+            </w:r>
+          </w:p>
+          <w:p>
+            <w:pPr>
+              <w:spacing w:after="0" w:line="240" w:lineRule="auto"/>
+            </w:pPr>
+            <w:r>
+              <w:rPr>
+                <w:rFonts w:ascii="Courier New" w:hAnsi="Courier New"/>
+                <w:sz w:val="16"/>
+              </w:rPr>
+              <w:t>009  }</w:t>
+            </w:r>
+          </w:p>
+          <w:p>
+            <w:pPr>
+              <w:spacing w:after="0" w:line="240" w:lineRule="auto"/>
+            </w:pPr>
+            <w:r>
+              <w:rPr>
+                <w:rFonts w:ascii="Courier New" w:hAnsi="Courier New"/>
+                <w:sz w:val="16"/>
+              </w:rPr>
+              <w:t xml:space="preserve">010  </w:t>
+            </w:r>
+          </w:p>
+          <w:p>
+            <w:pPr>
+              <w:spacing w:after="0" w:line="240" w:lineRule="auto"/>
+            </w:pPr>
+            <w:r>
+              <w:rPr>
+                <w:rFonts w:ascii="Courier New" w:hAnsi="Courier New"/>
+                <w:sz w:val="16"/>
+              </w:rPr>
+              <w:t>011  .page {</w:t>
+            </w:r>
+          </w:p>
+          <w:p>
+            <w:pPr>
+              <w:spacing w:after="0" w:line="240" w:lineRule="auto"/>
+            </w:pPr>
+            <w:r>
+              <w:rPr>
+                <w:rFonts w:ascii="Courier New" w:hAnsi="Courier New"/>
+                <w:sz w:val="16"/>
+              </w:rPr>
+              <w:t>012    width: min(760px, calc(100% - 40px));</w:t>
+            </w:r>
+          </w:p>
+          <w:p>
+            <w:pPr>
+              <w:spacing w:after="0" w:line="240" w:lineRule="auto"/>
+            </w:pPr>
+            <w:r>
+              <w:rPr>
+                <w:rFonts w:ascii="Courier New" w:hAnsi="Courier New"/>
+                <w:sz w:val="16"/>
+              </w:rPr>
+              <w:t>013    padding: 42px;</w:t>
+            </w:r>
+          </w:p>
+          <w:p>
+            <w:pPr>
+              <w:spacing w:after="0" w:line="240" w:lineRule="auto"/>
+            </w:pPr>
+            <w:r>
+              <w:rPr>
+                <w:rFonts w:ascii="Courier New" w:hAnsi="Courier New"/>
+                <w:sz w:val="16"/>
+              </w:rPr>
+              <w:t>014    background: #ffffff;</w:t>
+            </w:r>
+          </w:p>
+          <w:p>
+            <w:pPr>
+              <w:spacing w:after="0" w:line="240" w:lineRule="auto"/>
+            </w:pPr>
+            <w:r>
+              <w:rPr>
+                <w:rFonts w:ascii="Courier New" w:hAnsi="Courier New"/>
+                <w:sz w:val="16"/>
+              </w:rPr>
+              <w:t>015    border: 1px solid #d8dee8;</w:t>
+            </w:r>
+          </w:p>
+          <w:p>
+            <w:pPr>
+              <w:spacing w:after="0" w:line="240" w:lineRule="auto"/>
+            </w:pPr>
+            <w:r>
+              <w:rPr>
+                <w:rFonts w:ascii="Courier New" w:hAnsi="Courier New"/>
+                <w:sz w:val="16"/>
+              </w:rPr>
+              <w:t>016    border-radius: 8px;</w:t>
+            </w:r>
+          </w:p>
+          <w:p>
+            <w:pPr>
+              <w:spacing w:after="0" w:line="240" w:lineRule="auto"/>
+            </w:pPr>
+            <w:r>
+              <w:rPr>
+                <w:rFonts w:ascii="Courier New" w:hAnsi="Courier New"/>
+                <w:sz w:val="16"/>
+              </w:rPr>
+              <w:t>017    box-shadow: 0 18px 45px rgba(20, 28, 45, 0.12);</w:t>
+            </w:r>
+          </w:p>
+          <w:p>
+            <w:pPr>
+              <w:spacing w:after="0" w:line="240" w:lineRule="auto"/>
+            </w:pPr>
+            <w:r>
+              <w:rPr>
+                <w:rFonts w:ascii="Courier New" w:hAnsi="Courier New"/>
+                <w:sz w:val="16"/>
+              </w:rPr>
+              <w:t>018  }</w:t>
+            </w:r>
+          </w:p>
+          <w:p>
+            <w:pPr>
+              <w:spacing w:after="0" w:line="240" w:lineRule="auto"/>
+            </w:pPr>
+            <w:r>
+              <w:rPr>
+                <w:rFonts w:ascii="Courier New" w:hAnsi="Courier New"/>
+                <w:sz w:val="16"/>
+              </w:rPr>
+              <w:t xml:space="preserve">019  </w:t>
+            </w:r>
+          </w:p>
+          <w:p>
+            <w:pPr>
+              <w:spacing w:after="0" w:line="240" w:lineRule="auto"/>
+            </w:pPr>
+            <w:r>
+              <w:rPr>
+                <w:rFonts w:ascii="Courier New" w:hAnsi="Courier New"/>
+                <w:sz w:val="16"/>
+              </w:rPr>
+              <w:t>020  .eyebrow {</w:t>
+            </w:r>
+          </w:p>
+          <w:p>
+            <w:pPr>
+              <w:spacing w:after="0" w:line="240" w:lineRule="auto"/>
+            </w:pPr>
+            <w:r>
+              <w:rPr>
+                <w:rFonts w:ascii="Courier New" w:hAnsi="Courier New"/>
+                <w:sz w:val="16"/>
+              </w:rPr>
+              <w:t>021    margin: 0 0 12px;</w:t>
+            </w:r>
+          </w:p>
+          <w:p>
+            <w:pPr>
+              <w:spacing w:after="0" w:line="240" w:lineRule="auto"/>
+            </w:pPr>
+            <w:r>
+              <w:rPr>
+                <w:rFonts w:ascii="Courier New" w:hAnsi="Courier New"/>
+                <w:sz w:val="16"/>
+              </w:rPr>
+              <w:t>022    color: #2563eb;</w:t>
+            </w:r>
+          </w:p>
+          <w:p>
+            <w:pPr>
+              <w:spacing w:after="0" w:line="240" w:lineRule="auto"/>
+            </w:pPr>
+            <w:r>
+              <w:rPr>
+                <w:rFonts w:ascii="Courier New" w:hAnsi="Courier New"/>
+                <w:sz w:val="16"/>
+              </w:rPr>
+              <w:t>023    font-size: 14px;</w:t>
+            </w:r>
+          </w:p>
+          <w:p>
+            <w:pPr>
+              <w:spacing w:after="0" w:line="240" w:lineRule="auto"/>
+            </w:pPr>
+            <w:r>
+              <w:rPr>
+                <w:rFonts w:ascii="Courier New" w:hAnsi="Courier New"/>
+                <w:sz w:val="16"/>
+              </w:rPr>
+              <w:t>024    font-weight: 700;</w:t>
+            </w:r>
+          </w:p>
+          <w:p>
+            <w:pPr>
+              <w:spacing w:after="0" w:line="240" w:lineRule="auto"/>
+            </w:pPr>
+            <w:r>
+              <w:rPr>
+                <w:rFonts w:ascii="Courier New" w:hAnsi="Courier New"/>
+                <w:sz w:val="16"/>
+              </w:rPr>
+              <w:t>025    text-transform: uppercase;</w:t>
+            </w:r>
+          </w:p>
+          <w:p>
+            <w:pPr>
+              <w:spacing w:after="0" w:line="240" w:lineRule="auto"/>
+            </w:pPr>
+            <w:r>
+              <w:rPr>
+                <w:rFonts w:ascii="Courier New" w:hAnsi="Courier New"/>
+                <w:sz w:val="16"/>
+              </w:rPr>
+              <w:t>026  }</w:t>
+            </w:r>
+          </w:p>
+          <w:p>
+            <w:pPr>
+              <w:spacing w:after="0" w:line="240" w:lineRule="auto"/>
+            </w:pPr>
+            <w:r>
+              <w:rPr>
+                <w:rFonts w:ascii="Courier New" w:hAnsi="Courier New"/>
+                <w:sz w:val="16"/>
+              </w:rPr>
+              <w:t xml:space="preserve">027  </w:t>
+            </w:r>
+          </w:p>
+          <w:p>
+            <w:pPr>
+              <w:spacing w:after="0" w:line="240" w:lineRule="auto"/>
+            </w:pPr>
+            <w:r>
+              <w:rPr>
+                <w:rFonts w:ascii="Courier New" w:hAnsi="Courier New"/>
+                <w:sz w:val="16"/>
+              </w:rPr>
+              <w:t>028  h1 {</w:t>
+            </w:r>
+          </w:p>
+          <w:p>
+            <w:pPr>
+              <w:spacing w:after="0" w:line="240" w:lineRule="auto"/>
+            </w:pPr>
+            <w:r>
+              <w:rPr>
+                <w:rFonts w:ascii="Courier New" w:hAnsi="Courier New"/>
+                <w:sz w:val="16"/>
+              </w:rPr>
+              <w:t>029    margin: 0 0 16px;</w:t>
+            </w:r>
+          </w:p>
+          <w:p>
+            <w:pPr>
+              <w:spacing w:after="0" w:line="240" w:lineRule="auto"/>
+            </w:pPr>
+            <w:r>
+              <w:rPr>
+                <w:rFonts w:ascii="Courier New" w:hAnsi="Courier New"/>
+                <w:sz w:val="16"/>
+              </w:rPr>
+              <w:t>030    font-size: 38px;</w:t>
+            </w:r>
+          </w:p>
+          <w:p>
+            <w:pPr>
+              <w:spacing w:after="0" w:line="240" w:lineRule="auto"/>
+            </w:pPr>
+            <w:r>
+              <w:rPr>
+                <w:rFonts w:ascii="Courier New" w:hAnsi="Courier New"/>
+                <w:sz w:val="16"/>
+              </w:rPr>
+              <w:t>031    line-height: 1.1;</w:t>
+            </w:r>
+          </w:p>
+          <w:p>
+            <w:pPr>
+              <w:spacing w:after="0" w:line="240" w:lineRule="auto"/>
+            </w:pPr>
+            <w:r>
+              <w:rPr>
+                <w:rFonts w:ascii="Courier New" w:hAnsi="Courier New"/>
+                <w:sz w:val="16"/>
+              </w:rPr>
+              <w:t>032  }</w:t>
+            </w:r>
+          </w:p>
+          <w:p>
+            <w:pPr>
+              <w:spacing w:after="0" w:line="240" w:lineRule="auto"/>
+            </w:pPr>
+            <w:r>
+              <w:rPr>
+                <w:rFonts w:ascii="Courier New" w:hAnsi="Courier New"/>
+                <w:sz w:val="16"/>
+              </w:rPr>
+              <w:t xml:space="preserve">033  </w:t>
+            </w:r>
+          </w:p>
+          <w:p>
+            <w:pPr>
+              <w:spacing w:after="0" w:line="240" w:lineRule="auto"/>
+            </w:pPr>
+            <w:r>
+              <w:rPr>
+                <w:rFonts w:ascii="Courier New" w:hAnsi="Courier New"/>
+                <w:sz w:val="16"/>
+              </w:rPr>
+              <w:t>034  p,</w:t>
+            </w:r>
+          </w:p>
+          <w:p>
+            <w:pPr>
+              <w:spacing w:after="0" w:line="240" w:lineRule="auto"/>
+            </w:pPr>
+            <w:r>
+              <w:rPr>
+                <w:rFonts w:ascii="Courier New" w:hAnsi="Courier New"/>
+                <w:sz w:val="16"/>
+              </w:rPr>
+              <w:t>035  li {</w:t>
+            </w:r>
+          </w:p>
+          <w:p>
+            <w:pPr>
+              <w:spacing w:after="0" w:line="240" w:lineRule="auto"/>
+            </w:pPr>
+            <w:r>
+              <w:rPr>
+                <w:rFonts w:ascii="Courier New" w:hAnsi="Courier New"/>
+                <w:sz w:val="16"/>
+              </w:rPr>
+              <w:t>036    color: #4b5565;</w:t>
+            </w:r>
+          </w:p>
+          <w:p>
+            <w:pPr>
+              <w:spacing w:after="0" w:line="240" w:lineRule="auto"/>
+            </w:pPr>
+            <w:r>
+              <w:rPr>
+                <w:rFonts w:ascii="Courier New" w:hAnsi="Courier New"/>
+                <w:sz w:val="16"/>
+              </w:rPr>
+              <w:t>037    font-size: 18px;</w:t>
+            </w:r>
+          </w:p>
+          <w:p>
+            <w:pPr>
+              <w:spacing w:after="0" w:line="240" w:lineRule="auto"/>
+            </w:pPr>
+            <w:r>
+              <w:rPr>
+                <w:rFonts w:ascii="Courier New" w:hAnsi="Courier New"/>
+                <w:sz w:val="16"/>
+              </w:rPr>
+              <w:t>038    line-height: 1.6;</w:t>
+            </w:r>
+          </w:p>
+          <w:p>
+            <w:pPr>
+              <w:spacing w:after="0" w:line="240" w:lineRule="auto"/>
+            </w:pPr>
+            <w:r>
+              <w:rPr>
+                <w:rFonts w:ascii="Courier New" w:hAnsi="Courier New"/>
+                <w:sz w:val="16"/>
+              </w:rPr>
+              <w:t>039  }</w:t>
+            </w:r>
+          </w:p>
+          <w:p>
+            <w:pPr>
+              <w:spacing w:after="0" w:line="240" w:lineRule="auto"/>
+            </w:pPr>
+            <w:r>
+              <w:rPr>
+                <w:rFonts w:ascii="Courier New" w:hAnsi="Courier New"/>
+                <w:sz w:val="16"/>
+              </w:rPr>
+              <w:t xml:space="preserve">040  </w:t>
+            </w:r>
+          </w:p>
+          <w:p>
+            <w:pPr>
+              <w:spacing w:after="0" w:line="240" w:lineRule="auto"/>
+            </w:pPr>
+            <w:r>
+              <w:rPr>
+                <w:rFonts w:ascii="Courier New" w:hAnsi="Courier New"/>
+                <w:sz w:val="16"/>
+              </w:rPr>
+              <w:t>041  nav {</w:t>
+            </w:r>
+          </w:p>
+          <w:p>
+            <w:pPr>
+              <w:spacing w:after="0" w:line="240" w:lineRule="auto"/>
+            </w:pPr>
+            <w:r>
+              <w:rPr>
+                <w:rFonts w:ascii="Courier New" w:hAnsi="Courier New"/>
+                <w:sz w:val="16"/>
+              </w:rPr>
+              <w:t>042    display: flex;</w:t>
+            </w:r>
+          </w:p>
+          <w:p>
+            <w:pPr>
+              <w:spacing w:after="0" w:line="240" w:lineRule="auto"/>
+            </w:pPr>
+            <w:r>
+              <w:rPr>
+                <w:rFonts w:ascii="Courier New" w:hAnsi="Courier New"/>
+                <w:sz w:val="16"/>
+              </w:rPr>
+              <w:t>043    flex-wrap: wrap;</w:t>
+            </w:r>
+          </w:p>
+          <w:p>
+            <w:pPr>
+              <w:spacing w:after="0" w:line="240" w:lineRule="auto"/>
+            </w:pPr>
+            <w:r>
+              <w:rPr>
+                <w:rFonts w:ascii="Courier New" w:hAnsi="Courier New"/>
+                <w:sz w:val="16"/>
+              </w:rPr>
+              <w:t>044    gap: 12px;</w:t>
+            </w:r>
+          </w:p>
+          <w:p>
+            <w:pPr>
+              <w:spacing w:after="0" w:line="240" w:lineRule="auto"/>
+            </w:pPr>
+            <w:r>
+              <w:rPr>
+                <w:rFonts w:ascii="Courier New" w:hAnsi="Courier New"/>
+                <w:sz w:val="16"/>
+              </w:rPr>
+              <w:t>045    margin-top: 26px;</w:t>
+            </w:r>
+          </w:p>
+          <w:p>
+            <w:pPr>
+              <w:spacing w:after="0" w:line="240" w:lineRule="auto"/>
+            </w:pPr>
+            <w:r>
+              <w:rPr>
+                <w:rFonts w:ascii="Courier New" w:hAnsi="Courier New"/>
+                <w:sz w:val="16"/>
+              </w:rPr>
+              <w:t>046  }</w:t>
+            </w:r>
+          </w:p>
+          <w:p>
+            <w:pPr>
+              <w:spacing w:after="0" w:line="240" w:lineRule="auto"/>
+            </w:pPr>
+            <w:r>
+              <w:rPr>
+                <w:rFonts w:ascii="Courier New" w:hAnsi="Courier New"/>
+                <w:sz w:val="16"/>
+              </w:rPr>
+              <w:t xml:space="preserve">047  </w:t>
+            </w:r>
+          </w:p>
+          <w:p>
+            <w:pPr>
+              <w:spacing w:after="0" w:line="240" w:lineRule="auto"/>
+            </w:pPr>
+            <w:r>
+              <w:rPr>
+                <w:rFonts w:ascii="Courier New" w:hAnsi="Courier New"/>
+                <w:sz w:val="16"/>
+              </w:rPr>
+              <w:t>048  a {</w:t>
+            </w:r>
+          </w:p>
+          <w:p>
+            <w:pPr>
+              <w:spacing w:after="0" w:line="240" w:lineRule="auto"/>
+            </w:pPr>
+            <w:r>
+              <w:rPr>
+                <w:rFonts w:ascii="Courier New" w:hAnsi="Courier New"/>
+                <w:sz w:val="16"/>
+              </w:rPr>
+              <w:t>049    display: inline-flex;</w:t>
+            </w:r>
+          </w:p>
+          <w:p>
+            <w:pPr>
+              <w:spacing w:after="0" w:line="240" w:lineRule="auto"/>
+            </w:pPr>
+            <w:r>
+              <w:rPr>
+                <w:rFonts w:ascii="Courier New" w:hAnsi="Courier New"/>
+                <w:sz w:val="16"/>
+              </w:rPr>
+              <w:t>050    padding: 10px 14px;</w:t>
+            </w:r>
+          </w:p>
+          <w:p>
+            <w:pPr>
+              <w:spacing w:after="0" w:line="240" w:lineRule="auto"/>
+            </w:pPr>
+            <w:r>
+              <w:rPr>
+                <w:rFonts w:ascii="Courier New" w:hAnsi="Courier New"/>
+                <w:sz w:val="16"/>
+              </w:rPr>
+              <w:t>051    color: #ffffff;</w:t>
+            </w:r>
+          </w:p>
+          <w:p>
+            <w:pPr>
+              <w:spacing w:after="0" w:line="240" w:lineRule="auto"/>
+            </w:pPr>
+            <w:r>
+              <w:rPr>
+                <w:rFonts w:ascii="Courier New" w:hAnsi="Courier New"/>
+                <w:sz w:val="16"/>
+              </w:rPr>
+              <w:t>052    background: #2563eb;</w:t>
+            </w:r>
+          </w:p>
+          <w:p>
+            <w:pPr>
+              <w:spacing w:after="0" w:line="240" w:lineRule="auto"/>
+            </w:pPr>
+            <w:r>
+              <w:rPr>
+                <w:rFonts w:ascii="Courier New" w:hAnsi="Courier New"/>
+                <w:sz w:val="16"/>
+              </w:rPr>
+              <w:t>053    border-radius: 8px;</w:t>
+            </w:r>
+          </w:p>
+          <w:p>
+            <w:pPr>
+              <w:spacing w:after="0" w:line="240" w:lineRule="auto"/>
+            </w:pPr>
+            <w:r>
+              <w:rPr>
+                <w:rFonts w:ascii="Courier New" w:hAnsi="Courier New"/>
+                <w:sz w:val="16"/>
+              </w:rPr>
+              <w:t>054    text-decoration: none;</w:t>
+            </w:r>
+          </w:p>
+          <w:p>
+            <w:pPr>
+              <w:spacing w:after="0" w:line="240" w:lineRule="auto"/>
+            </w:pPr>
+            <w:r>
+              <w:rPr>
+                <w:rFonts w:ascii="Courier New" w:hAnsi="Courier New"/>
+                <w:sz w:val="16"/>
+              </w:rPr>
+              <w:t>055  }</w:t>
+            </w:r>
+          </w:p>
+          <w:p>
+            <w:pPr>
+              <w:spacing w:after="0" w:line="240" w:lineRule="auto"/>
+            </w:pPr>
+            <w:r>
+              <w:rPr>
+                <w:rFonts w:ascii="Courier New" w:hAnsi="Courier New"/>
+                <w:sz w:val="16"/>
+              </w:rPr>
+              <w:t xml:space="preserve">056  </w:t>
+            </w:r>
+          </w:p>
+          <w:p>
+            <w:pPr>
+              <w:spacing w:after="0" w:line="240" w:lineRule="auto"/>
+            </w:pPr>
+            <w:r>
+              <w:rPr>
+                <w:rFonts w:ascii="Courier New" w:hAnsi="Courier New"/>
+                <w:sz w:val="16"/>
+              </w:rPr>
+              <w:t>057  code {</w:t>
+            </w:r>
+          </w:p>
+          <w:p>
+            <w:pPr>
+              <w:spacing w:after="0" w:line="240" w:lineRule="auto"/>
+            </w:pPr>
+            <w:r>
+              <w:rPr>
+                <w:rFonts w:ascii="Courier New" w:hAnsi="Courier New"/>
+                <w:sz w:val="16"/>
+              </w:rPr>
+              <w:t>058    color: #0f2a5f;</w:t>
+            </w:r>
+          </w:p>
+          <w:p>
+            <w:pPr>
+              <w:spacing w:after="0" w:line="240" w:lineRule="auto"/>
+            </w:pPr>
+            <w:r>
+              <w:rPr>
+                <w:rFonts w:ascii="Courier New" w:hAnsi="Courier New"/>
+                <w:sz w:val="16"/>
+              </w:rPr>
+              <w:t>059    background: #edf5ff;</w:t>
+            </w:r>
+          </w:p>
+          <w:p>
+            <w:pPr>
+              <w:spacing w:after="0" w:line="240" w:lineRule="auto"/>
+            </w:pPr>
+            <w:r>
+              <w:rPr>
+                <w:rFonts w:ascii="Courier New" w:hAnsi="Courier New"/>
+                <w:sz w:val="16"/>
+              </w:rPr>
+              <w:t>060    padding: 2px 6px;</w:t>
+            </w:r>
+          </w:p>
+          <w:p>
+            <w:pPr>
+              <w:spacing w:after="0" w:line="240" w:lineRule="auto"/>
+            </w:pPr>
+            <w:r>
+              <w:rPr>
+                <w:rFonts w:ascii="Courier New" w:hAnsi="Courier New"/>
+                <w:sz w:val="16"/>
+              </w:rPr>
+              <w:t>061    border-radius: 5px;</w:t>
+            </w:r>
+          </w:p>
+          <w:p>
+            <w:pPr>
+              <w:spacing w:after="0" w:line="240" w:lineRule="auto"/>
+            </w:pPr>
+            <w:r>
+              <w:rPr>
+                <w:rFonts w:ascii="Courier New" w:hAnsi="Courier New"/>
+                <w:sz w:val="16"/>
+              </w:rPr>
+              <w:t>062  }</w:t>
+            </w:r>
+          </w:p>
+        </w:tc>
+      </w:tr>
+    </w:tbl>
     <w:sectPr>
       <w:footerReference w:type="default" r:id="rId8"/>
       <w:pgSz w:w="11906" w:h="16838"/>

</xml_diff>